<commit_message>
Add final results (ablation, test report) and complete academic report
Co-Authored-By: Claude Sonnet 5.5 <noreply@anthropic.com>
Claude-Session: https://claude.ai/code/session_01LG8YkFhbqHbAFqReZk7noe
</commit_message>
<xml_diff>
--- a/docs/informe_proyecto_medio.docx
+++ b/docs/informe_proyecto_medio.docx
@@ -93,24 +93,7 @@
           <w:sz w:val="24"/>
           <w:szCs w:val="24"/>
         </w:rPr>
-        <w:t xml:space="preserve">Este trabajo aborda la clasificación automática de enfermedades en hojas de café robusta a partir de fotografías, con el conjunto de datos público RoCoLe (1560 imágenes en tres clases: sana, roya y araña roja). Se construyó un flujo reproducible que incluye una partición 70/15/15 agrupada por planta y por duplicados para evitar fuga de datos, un generador de datos por lotes, una red generativa adversaria (GAN) condicional, una búsqueda de hiperparámetros con Hyperband y una validación cruzada con cinco esquemas. El mejor modelo encontrado (MobileNetV2 con transferencia de aprendizaje) alcanzó una exactitud media de 0,72–0,75 y un F1 macro de 0,58–0,61 en validación cruzada. El F1 macro, claramente inferior a la exactitud, evidencia que la clase minoritaria (araña roja, 10,7 % de las imágenes) se clasifica mal. Se evalúan pesos de clase, ajuste fino y aumento con imágenes sintéticas como mitigaciones.</w:t>
-      </w:r>
-    </w:p>
-    <w:p>
-      <w:pPr>
-        <w:spacing w:after="160"/>
-      </w:pPr>
-      <w:r>
-        <w:rPr>
-          <w:rFonts w:ascii="Times New Roman" w:cs="Times New Roman" w:eastAsia="Times New Roman" w:hAnsi="Times New Roman"/>
-          <w:b/>
-          <w:bCs/>
-          <w:sz w:val="24"/>
-          <w:szCs w:val="24"/>
-          <w:highlight w:val="yellow"/>
-          <w:highlightCs w:val="yellow"/>
-        </w:rPr>
-        <w:t xml:space="preserve">[PENDIENTE: actualizar el resumen con el resultado final en test y el efecto de las mejoras cuando se ejecute la sección de comparación del notebook.]</w:t>
+        <w:t xml:space="preserve">Este trabajo aborda la clasificación automática de enfermedades en hojas de café robusta a partir de fotografías, con el conjunto de datos público RoCoLe (1560 imágenes en tres clases: sana, roya y araña roja). Se construyó un flujo reproducible que incluye una partición 70/15/15 agrupada por planta y por duplicados para evitar fuga de datos, un generador de datos por lotes, una red generativa adversaria (GAN) condicional, una búsqueda de hiperparámetros con Hyperband y una validación cruzada con cinco esquemas. El mejor modelo encontrado (MobileNetV2 con transferencia de aprendizaje) alcanzó una exactitud media de 0,72–0,75 y un F1 macro de 0,58–0,61 en validación cruzada. El F1 macro, claramente inferior a la exactitud, evidencia que la clase minoritaria (araña roja, 10,7 % de las imágenes) se clasifica mal. Para mitigarlo se compararon pesos de clase, ajuste fino y aumento con imágenes sintéticas de una GAN. La variante elegida en validación (sobremuestreo con imágenes reales de la clase minoritaria) obtuvo en prueba una exactitud de 0,69 y un F1 macro de 0,60, con recall de 0,52 y precisión de 0,28 para araña roja. La GAN mejoró la clase minoritaria respecto al modelo base, pero no superó claramente al sobremuestreo simple.</w:t>
       </w:r>
     </w:p>
     <w:p>
@@ -3098,12 +3081,12 @@
           <w:sz w:val="24"/>
           <w:szCs w:val="24"/>
         </w:rPr>
-        <w:t xml:space="preserve">4.4 Comparación de mejoras y evaluación final</w:t>
+        <w:t xml:space="preserve">4.4 Comparación de mejoras en validación</w:t>
       </w:r>
     </w:p>
     <w:tbl>
       <w:tblPr>
-        <w:tblW w:type="dxa" w:w="9360"/>
+        <w:tblW w:type="dxa" w:w="9026"/>
         <w:tblBorders>
           <w:top w:val="single" w:color="auto" w:sz="4"/>
           <w:left w:val="single" w:color="auto" w:sz="4"/>
@@ -3114,11 +3097,13 @@
         </w:tblBorders>
       </w:tblPr>
       <w:tblGrid>
-        <w:gridCol w:w="3300"/>
+        <w:gridCol w:w="2500"/>
+        <w:gridCol w:w="900"/>
         <w:gridCol w:w="1100"/>
-        <w:gridCol w:w="1450"/>
-        <w:gridCol w:w="1450"/>
-        <w:gridCol w:w="2060"/>
+        <w:gridCol w:w="1100"/>
+        <w:gridCol w:w="1150"/>
+        <w:gridCol w:w="1150"/>
+        <w:gridCol w:w="1126"/>
       </w:tblGrid>
       <w:tr>
         <w:trPr>
@@ -3126,7 +3111,7 @@
         </w:trPr>
         <w:tc>
           <w:tcPr>
-            <w:tcW w:type="dxa" w:w="3300"/>
+            <w:tcW w:type="dxa" w:w="2500"/>
             <w:tcBorders>
               <w:top w:val="single" w:color="888888" w:sz="4"/>
               <w:left w:val="single" w:color="888888" w:sz="4"/>
@@ -3153,13 +3138,13 @@
                 <w:sz w:val="20"/>
                 <w:szCs w:val="20"/>
               </w:rPr>
-              <w:t xml:space="preserve">Variante (validación)</w:t>
-            </w:r>
-          </w:p>
-        </w:tc>
-        <w:tc>
-          <w:tcPr>
-            <w:tcW w:type="dxa" w:w="1100"/>
+              <w:t xml:space="preserve">Variante</w:t>
+            </w:r>
+          </w:p>
+        </w:tc>
+        <w:tc>
+          <w:tcPr>
+            <w:tcW w:type="dxa" w:w="900"/>
             <w:tcBorders>
               <w:top w:val="single" w:color="888888" w:sz="4"/>
               <w:left w:val="single" w:color="888888" w:sz="4"/>
@@ -3192,7 +3177,7 @@
         </w:tc>
         <w:tc>
           <w:tcPr>
-            <w:tcW w:type="dxa" w:w="1450"/>
+            <w:tcW w:type="dxa" w:w="1100"/>
             <w:tcBorders>
               <w:top w:val="single" w:color="888888" w:sz="4"/>
               <w:left w:val="single" w:color="888888" w:sz="4"/>
@@ -3225,7 +3210,7 @@
         </w:tc>
         <w:tc>
           <w:tcPr>
-            <w:tcW w:type="dxa" w:w="1450"/>
+            <w:tcW w:type="dxa" w:w="1100"/>
             <w:tcBorders>
               <w:top w:val="single" w:color="888888" w:sz="4"/>
               <w:left w:val="single" w:color="888888" w:sz="4"/>
@@ -3258,7 +3243,7 @@
         </w:tc>
         <w:tc>
           <w:tcPr>
-            <w:tcW w:type="dxa" w:w="2060"/>
+            <w:tcW w:type="dxa" w:w="1150"/>
             <w:tcBorders>
               <w:top w:val="single" w:color="888888" w:sz="4"/>
               <w:left w:val="single" w:color="888888" w:sz="4"/>
@@ -3285,7 +3270,73 @@
                 <w:sz w:val="20"/>
                 <w:szCs w:val="20"/>
               </w:rPr>
+              <w:t xml:space="preserve">F1 sana</w:t>
+            </w:r>
+          </w:p>
+        </w:tc>
+        <w:tc>
+          <w:tcPr>
+            <w:tcW w:type="dxa" w:w="1150"/>
+            <w:tcBorders>
+              <w:top w:val="single" w:color="888888" w:sz="4"/>
+              <w:left w:val="single" w:color="888888" w:sz="4"/>
+              <w:bottom w:val="single" w:color="888888" w:sz="4"/>
+              <w:right w:val="single" w:color="888888" w:sz="4"/>
+            </w:tcBorders>
+            <w:shd w:fill="E7EEF6" w:color="auto" w:val="clear"/>
+            <w:tcMar>
+              <w:top w:type="dxa" w:w="60"/>
+              <w:left w:type="dxa" w:w="100"/>
+              <w:bottom w:type="dxa" w:w="60"/>
+              <w:right w:type="dxa" w:w="100"/>
+            </w:tcMar>
+          </w:tcPr>
+          <w:p>
+            <w:pPr>
+              <w:jc w:val="center"/>
+            </w:pPr>
+            <w:r>
+              <w:rPr>
+                <w:rFonts w:ascii="Times New Roman" w:cs="Times New Roman" w:eastAsia="Times New Roman" w:hAnsi="Times New Roman"/>
+                <w:b/>
+                <w:bCs/>
+                <w:sz w:val="20"/>
+                <w:szCs w:val="20"/>
+              </w:rPr>
               <w:t xml:space="preserve">F1 araña roja</w:t>
+            </w:r>
+          </w:p>
+        </w:tc>
+        <w:tc>
+          <w:tcPr>
+            <w:tcW w:type="dxa" w:w="1126"/>
+            <w:tcBorders>
+              <w:top w:val="single" w:color="888888" w:sz="4"/>
+              <w:left w:val="single" w:color="888888" w:sz="4"/>
+              <w:bottom w:val="single" w:color="888888" w:sz="4"/>
+              <w:right w:val="single" w:color="888888" w:sz="4"/>
+            </w:tcBorders>
+            <w:shd w:fill="E7EEF6" w:color="auto" w:val="clear"/>
+            <w:tcMar>
+              <w:top w:type="dxa" w:w="60"/>
+              <w:left w:type="dxa" w:w="100"/>
+              <w:bottom w:type="dxa" w:w="60"/>
+              <w:right w:type="dxa" w:w="100"/>
+            </w:tcMar>
+          </w:tcPr>
+          <w:p>
+            <w:pPr>
+              <w:jc w:val="center"/>
+            </w:pPr>
+            <w:r>
+              <w:rPr>
+                <w:rFonts w:ascii="Times New Roman" w:cs="Times New Roman" w:eastAsia="Times New Roman" w:hAnsi="Times New Roman"/>
+                <w:b/>
+                <w:bCs/>
+                <w:sz w:val="20"/>
+                <w:szCs w:val="20"/>
+              </w:rPr>
+              <w:t xml:space="preserve">F1 roya</w:t>
             </w:r>
           </w:p>
         </w:tc>
@@ -3296,7 +3347,7 @@
         </w:trPr>
         <w:tc>
           <w:tcPr>
-            <w:tcW w:type="dxa" w:w="3300"/>
+            <w:tcW w:type="dxa" w:w="2500"/>
             <w:tcBorders>
               <w:top w:val="single" w:color="888888" w:sz="4"/>
               <w:left w:val="single" w:color="888888" w:sz="4"/>
@@ -3328,6 +3379,38 @@
         </w:tc>
         <w:tc>
           <w:tcPr>
+            <w:tcW w:type="dxa" w:w="900"/>
+            <w:tcBorders>
+              <w:top w:val="single" w:color="888888" w:sz="4"/>
+              <w:left w:val="single" w:color="888888" w:sz="4"/>
+              <w:bottom w:val="single" w:color="888888" w:sz="4"/>
+              <w:right w:val="single" w:color="888888" w:sz="4"/>
+            </w:tcBorders>
+            <w:tcMar>
+              <w:top w:type="dxa" w:w="60"/>
+              <w:left w:type="dxa" w:w="100"/>
+              <w:bottom w:type="dxa" w:w="60"/>
+              <w:right w:type="dxa" w:w="100"/>
+            </w:tcMar>
+          </w:tcPr>
+          <w:p>
+            <w:pPr>
+              <w:jc w:val="center"/>
+            </w:pPr>
+            <w:r>
+              <w:rPr>
+                <w:rFonts w:ascii="Times New Roman" w:cs="Times New Roman" w:eastAsia="Times New Roman" w:hAnsi="Times New Roman"/>
+                <w:b w:val="false"/>
+                <w:bCs w:val="false"/>
+                <w:sz w:val="20"/>
+                <w:szCs w:val="20"/>
+              </w:rPr>
+              <w:t xml:space="preserve">1092</w:t>
+            </w:r>
+          </w:p>
+        </w:tc>
+        <w:tc>
+          <w:tcPr>
             <w:tcW w:type="dxa" w:w="1100"/>
             <w:tcBorders>
               <w:top w:val="single" w:color="888888" w:sz="4"/>
@@ -3354,103 +3437,135 @@
                 <w:sz w:val="20"/>
                 <w:szCs w:val="20"/>
               </w:rPr>
-              <w:t xml:space="preserve">1092</w:t>
-            </w:r>
-          </w:p>
-        </w:tc>
-        <w:tc>
-          <w:tcPr>
-            <w:tcW w:type="dxa" w:w="1450"/>
-            <w:tcBorders>
-              <w:top w:val="single" w:color="888888" w:sz="4"/>
-              <w:left w:val="single" w:color="888888" w:sz="4"/>
-              <w:bottom w:val="single" w:color="888888" w:sz="4"/>
-              <w:right w:val="single" w:color="888888" w:sz="4"/>
-            </w:tcBorders>
-            <w:tcMar>
-              <w:top w:type="dxa" w:w="60"/>
-              <w:left w:type="dxa" w:w="100"/>
-              <w:bottom w:type="dxa" w:w="60"/>
-              <w:right w:type="dxa" w:w="100"/>
-            </w:tcMar>
-          </w:tcPr>
-          <w:p>
-            <w:pPr>
-              <w:jc w:val="center"/>
-            </w:pPr>
-            <w:r>
-              <w:rPr>
-                <w:rFonts w:ascii="Times New Roman" w:cs="Times New Roman" w:eastAsia="Times New Roman" w:hAnsi="Times New Roman"/>
-                <w:b w:val="false"/>
-                <w:bCs w:val="false"/>
-                <w:sz w:val="20"/>
-                <w:szCs w:val="20"/>
-              </w:rPr>
-              <w:t xml:space="preserve">—</w:t>
-            </w:r>
-          </w:p>
-        </w:tc>
-        <w:tc>
-          <w:tcPr>
-            <w:tcW w:type="dxa" w:w="1450"/>
-            <w:tcBorders>
-              <w:top w:val="single" w:color="888888" w:sz="4"/>
-              <w:left w:val="single" w:color="888888" w:sz="4"/>
-              <w:bottom w:val="single" w:color="888888" w:sz="4"/>
-              <w:right w:val="single" w:color="888888" w:sz="4"/>
-            </w:tcBorders>
-            <w:tcMar>
-              <w:top w:type="dxa" w:w="60"/>
-              <w:left w:type="dxa" w:w="100"/>
-              <w:bottom w:type="dxa" w:w="60"/>
-              <w:right w:type="dxa" w:w="100"/>
-            </w:tcMar>
-          </w:tcPr>
-          <w:p>
-            <w:pPr>
-              <w:jc w:val="center"/>
-            </w:pPr>
-            <w:r>
-              <w:rPr>
-                <w:rFonts w:ascii="Times New Roman" w:cs="Times New Roman" w:eastAsia="Times New Roman" w:hAnsi="Times New Roman"/>
-                <w:b w:val="false"/>
-                <w:bCs w:val="false"/>
-                <w:sz w:val="20"/>
-                <w:szCs w:val="20"/>
-              </w:rPr>
-              <w:t xml:space="preserve">—</w:t>
-            </w:r>
-          </w:p>
-        </w:tc>
-        <w:tc>
-          <w:tcPr>
-            <w:tcW w:type="dxa" w:w="2060"/>
-            <w:tcBorders>
-              <w:top w:val="single" w:color="888888" w:sz="4"/>
-              <w:left w:val="single" w:color="888888" w:sz="4"/>
-              <w:bottom w:val="single" w:color="888888" w:sz="4"/>
-              <w:right w:val="single" w:color="888888" w:sz="4"/>
-            </w:tcBorders>
-            <w:tcMar>
-              <w:top w:type="dxa" w:w="60"/>
-              <w:left w:type="dxa" w:w="100"/>
-              <w:bottom w:type="dxa" w:w="60"/>
-              <w:right w:type="dxa" w:w="100"/>
-            </w:tcMar>
-          </w:tcPr>
-          <w:p>
-            <w:pPr>
-              <w:jc w:val="center"/>
-            </w:pPr>
-            <w:r>
-              <w:rPr>
-                <w:rFonts w:ascii="Times New Roman" w:cs="Times New Roman" w:eastAsia="Times New Roman" w:hAnsi="Times New Roman"/>
-                <w:b w:val="false"/>
-                <w:bCs w:val="false"/>
-                <w:sz w:val="20"/>
-                <w:szCs w:val="20"/>
-              </w:rPr>
-              <w:t xml:space="preserve">—</w:t>
+              <w:t xml:space="preserve">0,766</w:t>
+            </w:r>
+          </w:p>
+        </w:tc>
+        <w:tc>
+          <w:tcPr>
+            <w:tcW w:type="dxa" w:w="1100"/>
+            <w:tcBorders>
+              <w:top w:val="single" w:color="888888" w:sz="4"/>
+              <w:left w:val="single" w:color="888888" w:sz="4"/>
+              <w:bottom w:val="single" w:color="888888" w:sz="4"/>
+              <w:right w:val="single" w:color="888888" w:sz="4"/>
+            </w:tcBorders>
+            <w:tcMar>
+              <w:top w:type="dxa" w:w="60"/>
+              <w:left w:type="dxa" w:w="100"/>
+              <w:bottom w:type="dxa" w:w="60"/>
+              <w:right w:type="dxa" w:w="100"/>
+            </w:tcMar>
+          </w:tcPr>
+          <w:p>
+            <w:pPr>
+              <w:jc w:val="center"/>
+            </w:pPr>
+            <w:r>
+              <w:rPr>
+                <w:rFonts w:ascii="Times New Roman" w:cs="Times New Roman" w:eastAsia="Times New Roman" w:hAnsi="Times New Roman"/>
+                <w:b w:val="false"/>
+                <w:bCs w:val="false"/>
+                <w:sz w:val="20"/>
+                <w:szCs w:val="20"/>
+              </w:rPr>
+              <w:t xml:space="preserve">0,636</w:t>
+            </w:r>
+          </w:p>
+        </w:tc>
+        <w:tc>
+          <w:tcPr>
+            <w:tcW w:type="dxa" w:w="1150"/>
+            <w:tcBorders>
+              <w:top w:val="single" w:color="888888" w:sz="4"/>
+              <w:left w:val="single" w:color="888888" w:sz="4"/>
+              <w:bottom w:val="single" w:color="888888" w:sz="4"/>
+              <w:right w:val="single" w:color="888888" w:sz="4"/>
+            </w:tcBorders>
+            <w:tcMar>
+              <w:top w:type="dxa" w:w="60"/>
+              <w:left w:type="dxa" w:w="100"/>
+              <w:bottom w:type="dxa" w:w="60"/>
+              <w:right w:type="dxa" w:w="100"/>
+            </w:tcMar>
+          </w:tcPr>
+          <w:p>
+            <w:pPr>
+              <w:jc w:val="center"/>
+            </w:pPr>
+            <w:r>
+              <w:rPr>
+                <w:rFonts w:ascii="Times New Roman" w:cs="Times New Roman" w:eastAsia="Times New Roman" w:hAnsi="Times New Roman"/>
+                <w:b w:val="false"/>
+                <w:bCs w:val="false"/>
+                <w:sz w:val="20"/>
+                <w:szCs w:val="20"/>
+              </w:rPr>
+              <w:t xml:space="preserve">0,856</w:t>
+            </w:r>
+          </w:p>
+        </w:tc>
+        <w:tc>
+          <w:tcPr>
+            <w:tcW w:type="dxa" w:w="1150"/>
+            <w:tcBorders>
+              <w:top w:val="single" w:color="888888" w:sz="4"/>
+              <w:left w:val="single" w:color="888888" w:sz="4"/>
+              <w:bottom w:val="single" w:color="888888" w:sz="4"/>
+              <w:right w:val="single" w:color="888888" w:sz="4"/>
+            </w:tcBorders>
+            <w:tcMar>
+              <w:top w:type="dxa" w:w="60"/>
+              <w:left w:type="dxa" w:w="100"/>
+              <w:bottom w:type="dxa" w:w="60"/>
+              <w:right w:type="dxa" w:w="100"/>
+            </w:tcMar>
+          </w:tcPr>
+          <w:p>
+            <w:pPr>
+              <w:jc w:val="center"/>
+            </w:pPr>
+            <w:r>
+              <w:rPr>
+                <w:rFonts w:ascii="Times New Roman" w:cs="Times New Roman" w:eastAsia="Times New Roman" w:hAnsi="Times New Roman"/>
+                <w:b w:val="false"/>
+                <w:bCs w:val="false"/>
+                <w:sz w:val="20"/>
+                <w:szCs w:val="20"/>
+              </w:rPr>
+              <w:t xml:space="preserve">0,324</w:t>
+            </w:r>
+          </w:p>
+        </w:tc>
+        <w:tc>
+          <w:tcPr>
+            <w:tcW w:type="dxa" w:w="1126"/>
+            <w:tcBorders>
+              <w:top w:val="single" w:color="888888" w:sz="4"/>
+              <w:left w:val="single" w:color="888888" w:sz="4"/>
+              <w:bottom w:val="single" w:color="888888" w:sz="4"/>
+              <w:right w:val="single" w:color="888888" w:sz="4"/>
+            </w:tcBorders>
+            <w:tcMar>
+              <w:top w:type="dxa" w:w="60"/>
+              <w:left w:type="dxa" w:w="100"/>
+              <w:bottom w:type="dxa" w:w="60"/>
+              <w:right w:type="dxa" w:w="100"/>
+            </w:tcMar>
+          </w:tcPr>
+          <w:p>
+            <w:pPr>
+              <w:jc w:val="center"/>
+            </w:pPr>
+            <w:r>
+              <w:rPr>
+                <w:rFonts w:ascii="Times New Roman" w:cs="Times New Roman" w:eastAsia="Times New Roman" w:hAnsi="Times New Roman"/>
+                <w:b w:val="false"/>
+                <w:bCs w:val="false"/>
+                <w:sz w:val="20"/>
+                <w:szCs w:val="20"/>
+              </w:rPr>
+              <w:t xml:space="preserve">0,727</w:t>
             </w:r>
           </w:p>
         </w:tc>
@@ -3461,7 +3576,7 @@
         </w:trPr>
         <w:tc>
           <w:tcPr>
-            <w:tcW w:type="dxa" w:w="3300"/>
+            <w:tcW w:type="dxa" w:w="2500"/>
             <w:tcBorders>
               <w:top w:val="single" w:color="888888" w:sz="4"/>
               <w:left w:val="single" w:color="888888" w:sz="4"/>
@@ -3493,6 +3608,38 @@
         </w:tc>
         <w:tc>
           <w:tcPr>
+            <w:tcW w:type="dxa" w:w="900"/>
+            <w:tcBorders>
+              <w:top w:val="single" w:color="888888" w:sz="4"/>
+              <w:left w:val="single" w:color="888888" w:sz="4"/>
+              <w:bottom w:val="single" w:color="888888" w:sz="4"/>
+              <w:right w:val="single" w:color="888888" w:sz="4"/>
+            </w:tcBorders>
+            <w:tcMar>
+              <w:top w:type="dxa" w:w="60"/>
+              <w:left w:type="dxa" w:w="100"/>
+              <w:bottom w:type="dxa" w:w="60"/>
+              <w:right w:type="dxa" w:w="100"/>
+            </w:tcMar>
+          </w:tcPr>
+          <w:p>
+            <w:pPr>
+              <w:jc w:val="center"/>
+            </w:pPr>
+            <w:r>
+              <w:rPr>
+                <w:rFonts w:ascii="Times New Roman" w:cs="Times New Roman" w:eastAsia="Times New Roman" w:hAnsi="Times New Roman"/>
+                <w:b w:val="false"/>
+                <w:bCs w:val="false"/>
+                <w:sz w:val="20"/>
+                <w:szCs w:val="20"/>
+              </w:rPr>
+              <w:t xml:space="preserve">1092</w:t>
+            </w:r>
+          </w:p>
+        </w:tc>
+        <w:tc>
+          <w:tcPr>
             <w:tcW w:type="dxa" w:w="1100"/>
             <w:tcBorders>
               <w:top w:val="single" w:color="888888" w:sz="4"/>
@@ -3519,103 +3666,135 @@
                 <w:sz w:val="20"/>
                 <w:szCs w:val="20"/>
               </w:rPr>
-              <w:t xml:space="preserve">1092</w:t>
-            </w:r>
-          </w:p>
-        </w:tc>
-        <w:tc>
-          <w:tcPr>
-            <w:tcW w:type="dxa" w:w="1450"/>
-            <w:tcBorders>
-              <w:top w:val="single" w:color="888888" w:sz="4"/>
-              <w:left w:val="single" w:color="888888" w:sz="4"/>
-              <w:bottom w:val="single" w:color="888888" w:sz="4"/>
-              <w:right w:val="single" w:color="888888" w:sz="4"/>
-            </w:tcBorders>
-            <w:tcMar>
-              <w:top w:type="dxa" w:w="60"/>
-              <w:left w:type="dxa" w:w="100"/>
-              <w:bottom w:type="dxa" w:w="60"/>
-              <w:right w:type="dxa" w:w="100"/>
-            </w:tcMar>
-          </w:tcPr>
-          <w:p>
-            <w:pPr>
-              <w:jc w:val="center"/>
-            </w:pPr>
-            <w:r>
-              <w:rPr>
-                <w:rFonts w:ascii="Times New Roman" w:cs="Times New Roman" w:eastAsia="Times New Roman" w:hAnsi="Times New Roman"/>
-                <w:b w:val="false"/>
-                <w:bCs w:val="false"/>
-                <w:sz w:val="20"/>
-                <w:szCs w:val="20"/>
-              </w:rPr>
-              <w:t xml:space="preserve">—</w:t>
-            </w:r>
-          </w:p>
-        </w:tc>
-        <w:tc>
-          <w:tcPr>
-            <w:tcW w:type="dxa" w:w="1450"/>
-            <w:tcBorders>
-              <w:top w:val="single" w:color="888888" w:sz="4"/>
-              <w:left w:val="single" w:color="888888" w:sz="4"/>
-              <w:bottom w:val="single" w:color="888888" w:sz="4"/>
-              <w:right w:val="single" w:color="888888" w:sz="4"/>
-            </w:tcBorders>
-            <w:tcMar>
-              <w:top w:type="dxa" w:w="60"/>
-              <w:left w:type="dxa" w:w="100"/>
-              <w:bottom w:type="dxa" w:w="60"/>
-              <w:right w:type="dxa" w:w="100"/>
-            </w:tcMar>
-          </w:tcPr>
-          <w:p>
-            <w:pPr>
-              <w:jc w:val="center"/>
-            </w:pPr>
-            <w:r>
-              <w:rPr>
-                <w:rFonts w:ascii="Times New Roman" w:cs="Times New Roman" w:eastAsia="Times New Roman" w:hAnsi="Times New Roman"/>
-                <w:b w:val="false"/>
-                <w:bCs w:val="false"/>
-                <w:sz w:val="20"/>
-                <w:szCs w:val="20"/>
-              </w:rPr>
-              <w:t xml:space="preserve">—</w:t>
-            </w:r>
-          </w:p>
-        </w:tc>
-        <w:tc>
-          <w:tcPr>
-            <w:tcW w:type="dxa" w:w="2060"/>
-            <w:tcBorders>
-              <w:top w:val="single" w:color="888888" w:sz="4"/>
-              <w:left w:val="single" w:color="888888" w:sz="4"/>
-              <w:bottom w:val="single" w:color="888888" w:sz="4"/>
-              <w:right w:val="single" w:color="888888" w:sz="4"/>
-            </w:tcBorders>
-            <w:tcMar>
-              <w:top w:type="dxa" w:w="60"/>
-              <w:left w:type="dxa" w:w="100"/>
-              <w:bottom w:type="dxa" w:w="60"/>
-              <w:right w:type="dxa" w:w="100"/>
-            </w:tcMar>
-          </w:tcPr>
-          <w:p>
-            <w:pPr>
-              <w:jc w:val="center"/>
-            </w:pPr>
-            <w:r>
-              <w:rPr>
-                <w:rFonts w:ascii="Times New Roman" w:cs="Times New Roman" w:eastAsia="Times New Roman" w:hAnsi="Times New Roman"/>
-                <w:b w:val="false"/>
-                <w:bCs w:val="false"/>
-                <w:sz w:val="20"/>
-                <w:szCs w:val="20"/>
-              </w:rPr>
-              <w:t xml:space="preserve">—</w:t>
+              <w:t xml:space="preserve">0,639</w:t>
+            </w:r>
+          </w:p>
+        </w:tc>
+        <w:tc>
+          <w:tcPr>
+            <w:tcW w:type="dxa" w:w="1100"/>
+            <w:tcBorders>
+              <w:top w:val="single" w:color="888888" w:sz="4"/>
+              <w:left w:val="single" w:color="888888" w:sz="4"/>
+              <w:bottom w:val="single" w:color="888888" w:sz="4"/>
+              <w:right w:val="single" w:color="888888" w:sz="4"/>
+            </w:tcBorders>
+            <w:tcMar>
+              <w:top w:type="dxa" w:w="60"/>
+              <w:left w:type="dxa" w:w="100"/>
+              <w:bottom w:type="dxa" w:w="60"/>
+              <w:right w:type="dxa" w:w="100"/>
+            </w:tcMar>
+          </w:tcPr>
+          <w:p>
+            <w:pPr>
+              <w:jc w:val="center"/>
+            </w:pPr>
+            <w:r>
+              <w:rPr>
+                <w:rFonts w:ascii="Times New Roman" w:cs="Times New Roman" w:eastAsia="Times New Roman" w:hAnsi="Times New Roman"/>
+                <w:b w:val="false"/>
+                <w:bCs w:val="false"/>
+                <w:sz w:val="20"/>
+                <w:szCs w:val="20"/>
+              </w:rPr>
+              <w:t xml:space="preserve">0,562</w:t>
+            </w:r>
+          </w:p>
+        </w:tc>
+        <w:tc>
+          <w:tcPr>
+            <w:tcW w:type="dxa" w:w="1150"/>
+            <w:tcBorders>
+              <w:top w:val="single" w:color="888888" w:sz="4"/>
+              <w:left w:val="single" w:color="888888" w:sz="4"/>
+              <w:bottom w:val="single" w:color="888888" w:sz="4"/>
+              <w:right w:val="single" w:color="888888" w:sz="4"/>
+            </w:tcBorders>
+            <w:tcMar>
+              <w:top w:type="dxa" w:w="60"/>
+              <w:left w:type="dxa" w:w="100"/>
+              <w:bottom w:type="dxa" w:w="60"/>
+              <w:right w:type="dxa" w:w="100"/>
+            </w:tcMar>
+          </w:tcPr>
+          <w:p>
+            <w:pPr>
+              <w:jc w:val="center"/>
+            </w:pPr>
+            <w:r>
+              <w:rPr>
+                <w:rFonts w:ascii="Times New Roman" w:cs="Times New Roman" w:eastAsia="Times New Roman" w:hAnsi="Times New Roman"/>
+                <w:b w:val="false"/>
+                <w:bCs w:val="false"/>
+                <w:sz w:val="20"/>
+                <w:szCs w:val="20"/>
+              </w:rPr>
+              <w:t xml:space="preserve">0,718</w:t>
+            </w:r>
+          </w:p>
+        </w:tc>
+        <w:tc>
+          <w:tcPr>
+            <w:tcW w:type="dxa" w:w="1150"/>
+            <w:tcBorders>
+              <w:top w:val="single" w:color="888888" w:sz="4"/>
+              <w:left w:val="single" w:color="888888" w:sz="4"/>
+              <w:bottom w:val="single" w:color="888888" w:sz="4"/>
+              <w:right w:val="single" w:color="888888" w:sz="4"/>
+            </w:tcBorders>
+            <w:tcMar>
+              <w:top w:type="dxa" w:w="60"/>
+              <w:left w:type="dxa" w:w="100"/>
+              <w:bottom w:type="dxa" w:w="60"/>
+              <w:right w:type="dxa" w:w="100"/>
+            </w:tcMar>
+          </w:tcPr>
+          <w:p>
+            <w:pPr>
+              <w:jc w:val="center"/>
+            </w:pPr>
+            <w:r>
+              <w:rPr>
+                <w:rFonts w:ascii="Times New Roman" w:cs="Times New Roman" w:eastAsia="Times New Roman" w:hAnsi="Times New Roman"/>
+                <w:b w:val="false"/>
+                <w:bCs w:val="false"/>
+                <w:sz w:val="20"/>
+                <w:szCs w:val="20"/>
+              </w:rPr>
+              <w:t xml:space="preserve">0,340</w:t>
+            </w:r>
+          </w:p>
+        </w:tc>
+        <w:tc>
+          <w:tcPr>
+            <w:tcW w:type="dxa" w:w="1126"/>
+            <w:tcBorders>
+              <w:top w:val="single" w:color="888888" w:sz="4"/>
+              <w:left w:val="single" w:color="888888" w:sz="4"/>
+              <w:bottom w:val="single" w:color="888888" w:sz="4"/>
+              <w:right w:val="single" w:color="888888" w:sz="4"/>
+            </w:tcBorders>
+            <w:tcMar>
+              <w:top w:type="dxa" w:w="60"/>
+              <w:left w:type="dxa" w:w="100"/>
+              <w:bottom w:type="dxa" w:w="60"/>
+              <w:right w:type="dxa" w:w="100"/>
+            </w:tcMar>
+          </w:tcPr>
+          <w:p>
+            <w:pPr>
+              <w:jc w:val="center"/>
+            </w:pPr>
+            <w:r>
+              <w:rPr>
+                <w:rFonts w:ascii="Times New Roman" w:cs="Times New Roman" w:eastAsia="Times New Roman" w:hAnsi="Times New Roman"/>
+                <w:b w:val="false"/>
+                <w:bCs w:val="false"/>
+                <w:sz w:val="20"/>
+                <w:szCs w:val="20"/>
+              </w:rPr>
+              <w:t xml:space="preserve">0,629</w:t>
             </w:r>
           </w:p>
         </w:tc>
@@ -3626,7 +3805,7 @@
         </w:trPr>
         <w:tc>
           <w:tcPr>
-            <w:tcW w:type="dxa" w:w="3300"/>
+            <w:tcW w:type="dxa" w:w="2500"/>
             <w:tcBorders>
               <w:top w:val="single" w:color="888888" w:sz="4"/>
               <w:left w:val="single" w:color="888888" w:sz="4"/>
@@ -3658,6 +3837,38 @@
         </w:tc>
         <w:tc>
           <w:tcPr>
+            <w:tcW w:type="dxa" w:w="900"/>
+            <w:tcBorders>
+              <w:top w:val="single" w:color="888888" w:sz="4"/>
+              <w:left w:val="single" w:color="888888" w:sz="4"/>
+              <w:bottom w:val="single" w:color="888888" w:sz="4"/>
+              <w:right w:val="single" w:color="888888" w:sz="4"/>
+            </w:tcBorders>
+            <w:tcMar>
+              <w:top w:type="dxa" w:w="60"/>
+              <w:left w:type="dxa" w:w="100"/>
+              <w:bottom w:type="dxa" w:w="60"/>
+              <w:right w:type="dxa" w:w="100"/>
+            </w:tcMar>
+          </w:tcPr>
+          <w:p>
+            <w:pPr>
+              <w:jc w:val="center"/>
+            </w:pPr>
+            <w:r>
+              <w:rPr>
+                <w:rFonts w:ascii="Times New Roman" w:cs="Times New Roman" w:eastAsia="Times New Roman" w:hAnsi="Times New Roman"/>
+                <w:b w:val="false"/>
+                <w:bCs w:val="false"/>
+                <w:sz w:val="20"/>
+                <w:szCs w:val="20"/>
+              </w:rPr>
+              <w:t xml:space="preserve">1092</w:t>
+            </w:r>
+          </w:p>
+        </w:tc>
+        <w:tc>
+          <w:tcPr>
             <w:tcW w:type="dxa" w:w="1100"/>
             <w:tcBorders>
               <w:top w:val="single" w:color="888888" w:sz="4"/>
@@ -3684,103 +3895,135 @@
                 <w:sz w:val="20"/>
                 <w:szCs w:val="20"/>
               </w:rPr>
-              <w:t xml:space="preserve">1092</w:t>
-            </w:r>
-          </w:p>
-        </w:tc>
-        <w:tc>
-          <w:tcPr>
-            <w:tcW w:type="dxa" w:w="1450"/>
-            <w:tcBorders>
-              <w:top w:val="single" w:color="888888" w:sz="4"/>
-              <w:left w:val="single" w:color="888888" w:sz="4"/>
-              <w:bottom w:val="single" w:color="888888" w:sz="4"/>
-              <w:right w:val="single" w:color="888888" w:sz="4"/>
-            </w:tcBorders>
-            <w:tcMar>
-              <w:top w:type="dxa" w:w="60"/>
-              <w:left w:type="dxa" w:w="100"/>
-              <w:bottom w:type="dxa" w:w="60"/>
-              <w:right w:type="dxa" w:w="100"/>
-            </w:tcMar>
-          </w:tcPr>
-          <w:p>
-            <w:pPr>
-              <w:jc w:val="center"/>
-            </w:pPr>
-            <w:r>
-              <w:rPr>
-                <w:rFonts w:ascii="Times New Roman" w:cs="Times New Roman" w:eastAsia="Times New Roman" w:hAnsi="Times New Roman"/>
-                <w:b w:val="false"/>
-                <w:bCs w:val="false"/>
-                <w:sz w:val="20"/>
-                <w:szCs w:val="20"/>
-              </w:rPr>
-              <w:t xml:space="preserve">—</w:t>
-            </w:r>
-          </w:p>
-        </w:tc>
-        <w:tc>
-          <w:tcPr>
-            <w:tcW w:type="dxa" w:w="1450"/>
-            <w:tcBorders>
-              <w:top w:val="single" w:color="888888" w:sz="4"/>
-              <w:left w:val="single" w:color="888888" w:sz="4"/>
-              <w:bottom w:val="single" w:color="888888" w:sz="4"/>
-              <w:right w:val="single" w:color="888888" w:sz="4"/>
-            </w:tcBorders>
-            <w:tcMar>
-              <w:top w:type="dxa" w:w="60"/>
-              <w:left w:type="dxa" w:w="100"/>
-              <w:bottom w:type="dxa" w:w="60"/>
-              <w:right w:type="dxa" w:w="100"/>
-            </w:tcMar>
-          </w:tcPr>
-          <w:p>
-            <w:pPr>
-              <w:jc w:val="center"/>
-            </w:pPr>
-            <w:r>
-              <w:rPr>
-                <w:rFonts w:ascii="Times New Roman" w:cs="Times New Roman" w:eastAsia="Times New Roman" w:hAnsi="Times New Roman"/>
-                <w:b w:val="false"/>
-                <w:bCs w:val="false"/>
-                <w:sz w:val="20"/>
-                <w:szCs w:val="20"/>
-              </w:rPr>
-              <w:t xml:space="preserve">—</w:t>
-            </w:r>
-          </w:p>
-        </w:tc>
-        <w:tc>
-          <w:tcPr>
-            <w:tcW w:type="dxa" w:w="2060"/>
-            <w:tcBorders>
-              <w:top w:val="single" w:color="888888" w:sz="4"/>
-              <w:left w:val="single" w:color="888888" w:sz="4"/>
-              <w:bottom w:val="single" w:color="888888" w:sz="4"/>
-              <w:right w:val="single" w:color="888888" w:sz="4"/>
-            </w:tcBorders>
-            <w:tcMar>
-              <w:top w:type="dxa" w:w="60"/>
-              <w:left w:type="dxa" w:w="100"/>
-              <w:bottom w:type="dxa" w:w="60"/>
-              <w:right w:type="dxa" w:w="100"/>
-            </w:tcMar>
-          </w:tcPr>
-          <w:p>
-            <w:pPr>
-              <w:jc w:val="center"/>
-            </w:pPr>
-            <w:r>
-              <w:rPr>
-                <w:rFonts w:ascii="Times New Roman" w:cs="Times New Roman" w:eastAsia="Times New Roman" w:hAnsi="Times New Roman"/>
-                <w:b w:val="false"/>
-                <w:bCs w:val="false"/>
-                <w:sz w:val="20"/>
-                <w:szCs w:val="20"/>
-              </w:rPr>
-              <w:t xml:space="preserve">—</w:t>
+              <w:t xml:space="preserve">0,709</w:t>
+            </w:r>
+          </w:p>
+        </w:tc>
+        <w:tc>
+          <w:tcPr>
+            <w:tcW w:type="dxa" w:w="1100"/>
+            <w:tcBorders>
+              <w:top w:val="single" w:color="888888" w:sz="4"/>
+              <w:left w:val="single" w:color="888888" w:sz="4"/>
+              <w:bottom w:val="single" w:color="888888" w:sz="4"/>
+              <w:right w:val="single" w:color="888888" w:sz="4"/>
+            </w:tcBorders>
+            <w:tcMar>
+              <w:top w:type="dxa" w:w="60"/>
+              <w:left w:type="dxa" w:w="100"/>
+              <w:bottom w:type="dxa" w:w="60"/>
+              <w:right w:type="dxa" w:w="100"/>
+            </w:tcMar>
+          </w:tcPr>
+          <w:p>
+            <w:pPr>
+              <w:jc w:val="center"/>
+            </w:pPr>
+            <w:r>
+              <w:rPr>
+                <w:rFonts w:ascii="Times New Roman" w:cs="Times New Roman" w:eastAsia="Times New Roman" w:hAnsi="Times New Roman"/>
+                <w:b w:val="false"/>
+                <w:bCs w:val="false"/>
+                <w:sz w:val="20"/>
+                <w:szCs w:val="20"/>
+              </w:rPr>
+              <w:t xml:space="preserve">0,638</w:t>
+            </w:r>
+          </w:p>
+        </w:tc>
+        <w:tc>
+          <w:tcPr>
+            <w:tcW w:type="dxa" w:w="1150"/>
+            <w:tcBorders>
+              <w:top w:val="single" w:color="888888" w:sz="4"/>
+              <w:left w:val="single" w:color="888888" w:sz="4"/>
+              <w:bottom w:val="single" w:color="888888" w:sz="4"/>
+              <w:right w:val="single" w:color="888888" w:sz="4"/>
+            </w:tcBorders>
+            <w:tcMar>
+              <w:top w:type="dxa" w:w="60"/>
+              <w:left w:type="dxa" w:w="100"/>
+              <w:bottom w:type="dxa" w:w="60"/>
+              <w:right w:type="dxa" w:w="100"/>
+            </w:tcMar>
+          </w:tcPr>
+          <w:p>
+            <w:pPr>
+              <w:jc w:val="center"/>
+            </w:pPr>
+            <w:r>
+              <w:rPr>
+                <w:rFonts w:ascii="Times New Roman" w:cs="Times New Roman" w:eastAsia="Times New Roman" w:hAnsi="Times New Roman"/>
+                <w:b w:val="false"/>
+                <w:bCs w:val="false"/>
+                <w:sz w:val="20"/>
+                <w:szCs w:val="20"/>
+              </w:rPr>
+              <w:t xml:space="preserve">0,807</w:t>
+            </w:r>
+          </w:p>
+        </w:tc>
+        <w:tc>
+          <w:tcPr>
+            <w:tcW w:type="dxa" w:w="1150"/>
+            <w:tcBorders>
+              <w:top w:val="single" w:color="888888" w:sz="4"/>
+              <w:left w:val="single" w:color="888888" w:sz="4"/>
+              <w:bottom w:val="single" w:color="888888" w:sz="4"/>
+              <w:right w:val="single" w:color="888888" w:sz="4"/>
+            </w:tcBorders>
+            <w:tcMar>
+              <w:top w:type="dxa" w:w="60"/>
+              <w:left w:type="dxa" w:w="100"/>
+              <w:bottom w:type="dxa" w:w="60"/>
+              <w:right w:type="dxa" w:w="100"/>
+            </w:tcMar>
+          </w:tcPr>
+          <w:p>
+            <w:pPr>
+              <w:jc w:val="center"/>
+            </w:pPr>
+            <w:r>
+              <w:rPr>
+                <w:rFonts w:ascii="Times New Roman" w:cs="Times New Roman" w:eastAsia="Times New Roman" w:hAnsi="Times New Roman"/>
+                <w:b w:val="false"/>
+                <w:bCs w:val="false"/>
+                <w:sz w:val="20"/>
+                <w:szCs w:val="20"/>
+              </w:rPr>
+              <w:t xml:space="preserve">0,444</w:t>
+            </w:r>
+          </w:p>
+        </w:tc>
+        <w:tc>
+          <w:tcPr>
+            <w:tcW w:type="dxa" w:w="1126"/>
+            <w:tcBorders>
+              <w:top w:val="single" w:color="888888" w:sz="4"/>
+              <w:left w:val="single" w:color="888888" w:sz="4"/>
+              <w:bottom w:val="single" w:color="888888" w:sz="4"/>
+              <w:right w:val="single" w:color="888888" w:sz="4"/>
+            </w:tcBorders>
+            <w:tcMar>
+              <w:top w:type="dxa" w:w="60"/>
+              <w:left w:type="dxa" w:w="100"/>
+              <w:bottom w:type="dxa" w:w="60"/>
+              <w:right w:type="dxa" w:w="100"/>
+            </w:tcMar>
+          </w:tcPr>
+          <w:p>
+            <w:pPr>
+              <w:jc w:val="center"/>
+            </w:pPr>
+            <w:r>
+              <w:rPr>
+                <w:rFonts w:ascii="Times New Roman" w:cs="Times New Roman" w:eastAsia="Times New Roman" w:hAnsi="Times New Roman"/>
+                <w:b w:val="false"/>
+                <w:bCs w:val="false"/>
+                <w:sz w:val="20"/>
+                <w:szCs w:val="20"/>
+              </w:rPr>
+              <w:t xml:space="preserve">0,663</w:t>
             </w:r>
           </w:p>
         </w:tc>
@@ -3791,7 +4034,7 @@
         </w:trPr>
         <w:tc>
           <w:tcPr>
-            <w:tcW w:type="dxa" w:w="3300"/>
+            <w:tcW w:type="dxa" w:w="2500"/>
             <w:tcBorders>
               <w:top w:val="single" w:color="888888" w:sz="4"/>
               <w:left w:val="single" w:color="888888" w:sz="4"/>
@@ -3823,6 +4066,38 @@
         </w:tc>
         <w:tc>
           <w:tcPr>
+            <w:tcW w:type="dxa" w:w="900"/>
+            <w:tcBorders>
+              <w:top w:val="single" w:color="888888" w:sz="4"/>
+              <w:left w:val="single" w:color="888888" w:sz="4"/>
+              <w:bottom w:val="single" w:color="888888" w:sz="4"/>
+              <w:right w:val="single" w:color="888888" w:sz="4"/>
+            </w:tcBorders>
+            <w:tcMar>
+              <w:top w:type="dxa" w:w="60"/>
+              <w:left w:type="dxa" w:w="100"/>
+              <w:bottom w:type="dxa" w:w="60"/>
+              <w:right w:type="dxa" w:w="100"/>
+            </w:tcMar>
+          </w:tcPr>
+          <w:p>
+            <w:pPr>
+              <w:jc w:val="center"/>
+            </w:pPr>
+            <w:r>
+              <w:rPr>
+                <w:rFonts w:ascii="Times New Roman" w:cs="Times New Roman" w:eastAsia="Times New Roman" w:hAnsi="Times New Roman"/>
+                <w:b w:val="false"/>
+                <w:bCs w:val="false"/>
+                <w:sz w:val="20"/>
+                <w:szCs w:val="20"/>
+              </w:rPr>
+              <w:t xml:space="preserve">1242</w:t>
+            </w:r>
+          </w:p>
+        </w:tc>
+        <w:tc>
+          <w:tcPr>
             <w:tcW w:type="dxa" w:w="1100"/>
             <w:tcBorders>
               <w:top w:val="single" w:color="888888" w:sz="4"/>
@@ -3849,103 +4124,135 @@
                 <w:sz w:val="20"/>
                 <w:szCs w:val="20"/>
               </w:rPr>
-              <w:t xml:space="preserve">—</w:t>
-            </w:r>
-          </w:p>
-        </w:tc>
-        <w:tc>
-          <w:tcPr>
-            <w:tcW w:type="dxa" w:w="1450"/>
-            <w:tcBorders>
-              <w:top w:val="single" w:color="888888" w:sz="4"/>
-              <w:left w:val="single" w:color="888888" w:sz="4"/>
-              <w:bottom w:val="single" w:color="888888" w:sz="4"/>
-              <w:right w:val="single" w:color="888888" w:sz="4"/>
-            </w:tcBorders>
-            <w:tcMar>
-              <w:top w:type="dxa" w:w="60"/>
-              <w:left w:type="dxa" w:w="100"/>
-              <w:bottom w:type="dxa" w:w="60"/>
-              <w:right w:type="dxa" w:w="100"/>
-            </w:tcMar>
-          </w:tcPr>
-          <w:p>
-            <w:pPr>
-              <w:jc w:val="center"/>
-            </w:pPr>
-            <w:r>
-              <w:rPr>
-                <w:rFonts w:ascii="Times New Roman" w:cs="Times New Roman" w:eastAsia="Times New Roman" w:hAnsi="Times New Roman"/>
-                <w:b w:val="false"/>
-                <w:bCs w:val="false"/>
-                <w:sz w:val="20"/>
-                <w:szCs w:val="20"/>
-              </w:rPr>
-              <w:t xml:space="preserve">—</w:t>
-            </w:r>
-          </w:p>
-        </w:tc>
-        <w:tc>
-          <w:tcPr>
-            <w:tcW w:type="dxa" w:w="1450"/>
-            <w:tcBorders>
-              <w:top w:val="single" w:color="888888" w:sz="4"/>
-              <w:left w:val="single" w:color="888888" w:sz="4"/>
-              <w:bottom w:val="single" w:color="888888" w:sz="4"/>
-              <w:right w:val="single" w:color="888888" w:sz="4"/>
-            </w:tcBorders>
-            <w:tcMar>
-              <w:top w:type="dxa" w:w="60"/>
-              <w:left w:type="dxa" w:w="100"/>
-              <w:bottom w:type="dxa" w:w="60"/>
-              <w:right w:type="dxa" w:w="100"/>
-            </w:tcMar>
-          </w:tcPr>
-          <w:p>
-            <w:pPr>
-              <w:jc w:val="center"/>
-            </w:pPr>
-            <w:r>
-              <w:rPr>
-                <w:rFonts w:ascii="Times New Roman" w:cs="Times New Roman" w:eastAsia="Times New Roman" w:hAnsi="Times New Roman"/>
-                <w:b w:val="false"/>
-                <w:bCs w:val="false"/>
-                <w:sz w:val="20"/>
-                <w:szCs w:val="20"/>
-              </w:rPr>
-              <w:t xml:space="preserve">—</w:t>
-            </w:r>
-          </w:p>
-        </w:tc>
-        <w:tc>
-          <w:tcPr>
-            <w:tcW w:type="dxa" w:w="2060"/>
-            <w:tcBorders>
-              <w:top w:val="single" w:color="888888" w:sz="4"/>
-              <w:left w:val="single" w:color="888888" w:sz="4"/>
-              <w:bottom w:val="single" w:color="888888" w:sz="4"/>
-              <w:right w:val="single" w:color="888888" w:sz="4"/>
-            </w:tcBorders>
-            <w:tcMar>
-              <w:top w:type="dxa" w:w="60"/>
-              <w:left w:type="dxa" w:w="100"/>
-              <w:bottom w:type="dxa" w:w="60"/>
-              <w:right w:type="dxa" w:w="100"/>
-            </w:tcMar>
-          </w:tcPr>
-          <w:p>
-            <w:pPr>
-              <w:jc w:val="center"/>
-            </w:pPr>
-            <w:r>
-              <w:rPr>
-                <w:rFonts w:ascii="Times New Roman" w:cs="Times New Roman" w:eastAsia="Times New Roman" w:hAnsi="Times New Roman"/>
-                <w:b w:val="false"/>
-                <w:bCs w:val="false"/>
-                <w:sz w:val="20"/>
-                <w:szCs w:val="20"/>
-              </w:rPr>
-              <w:t xml:space="preserve">—</w:t>
+              <w:t xml:space="preserve">0,725</w:t>
+            </w:r>
+          </w:p>
+        </w:tc>
+        <w:tc>
+          <w:tcPr>
+            <w:tcW w:type="dxa" w:w="1100"/>
+            <w:tcBorders>
+              <w:top w:val="single" w:color="888888" w:sz="4"/>
+              <w:left w:val="single" w:color="888888" w:sz="4"/>
+              <w:bottom w:val="single" w:color="888888" w:sz="4"/>
+              <w:right w:val="single" w:color="888888" w:sz="4"/>
+            </w:tcBorders>
+            <w:tcMar>
+              <w:top w:type="dxa" w:w="60"/>
+              <w:left w:type="dxa" w:w="100"/>
+              <w:bottom w:type="dxa" w:w="60"/>
+              <w:right w:type="dxa" w:w="100"/>
+            </w:tcMar>
+          </w:tcPr>
+          <w:p>
+            <w:pPr>
+              <w:jc w:val="center"/>
+            </w:pPr>
+            <w:r>
+              <w:rPr>
+                <w:rFonts w:ascii="Times New Roman" w:cs="Times New Roman" w:eastAsia="Times New Roman" w:hAnsi="Times New Roman"/>
+                <w:b w:val="false"/>
+                <w:bCs w:val="false"/>
+                <w:sz w:val="20"/>
+                <w:szCs w:val="20"/>
+              </w:rPr>
+              <w:t xml:space="preserve">0,666</w:t>
+            </w:r>
+          </w:p>
+        </w:tc>
+        <w:tc>
+          <w:tcPr>
+            <w:tcW w:type="dxa" w:w="1150"/>
+            <w:tcBorders>
+              <w:top w:val="single" w:color="888888" w:sz="4"/>
+              <w:left w:val="single" w:color="888888" w:sz="4"/>
+              <w:bottom w:val="single" w:color="888888" w:sz="4"/>
+              <w:right w:val="single" w:color="888888" w:sz="4"/>
+            </w:tcBorders>
+            <w:tcMar>
+              <w:top w:type="dxa" w:w="60"/>
+              <w:left w:type="dxa" w:w="100"/>
+              <w:bottom w:type="dxa" w:w="60"/>
+              <w:right w:type="dxa" w:w="100"/>
+            </w:tcMar>
+          </w:tcPr>
+          <w:p>
+            <w:pPr>
+              <w:jc w:val="center"/>
+            </w:pPr>
+            <w:r>
+              <w:rPr>
+                <w:rFonts w:ascii="Times New Roman" w:cs="Times New Roman" w:eastAsia="Times New Roman" w:hAnsi="Times New Roman"/>
+                <w:b w:val="false"/>
+                <w:bCs w:val="false"/>
+                <w:sz w:val="20"/>
+                <w:szCs w:val="20"/>
+              </w:rPr>
+              <w:t xml:space="preserve">0,843</w:t>
+            </w:r>
+          </w:p>
+        </w:tc>
+        <w:tc>
+          <w:tcPr>
+            <w:tcW w:type="dxa" w:w="1150"/>
+            <w:tcBorders>
+              <w:top w:val="single" w:color="888888" w:sz="4"/>
+              <w:left w:val="single" w:color="888888" w:sz="4"/>
+              <w:bottom w:val="single" w:color="888888" w:sz="4"/>
+              <w:right w:val="single" w:color="888888" w:sz="4"/>
+            </w:tcBorders>
+            <w:tcMar>
+              <w:top w:type="dxa" w:w="60"/>
+              <w:left w:type="dxa" w:w="100"/>
+              <w:bottom w:type="dxa" w:w="60"/>
+              <w:right w:type="dxa" w:w="100"/>
+            </w:tcMar>
+          </w:tcPr>
+          <w:p>
+            <w:pPr>
+              <w:jc w:val="center"/>
+            </w:pPr>
+            <w:r>
+              <w:rPr>
+                <w:rFonts w:ascii="Times New Roman" w:cs="Times New Roman" w:eastAsia="Times New Roman" w:hAnsi="Times New Roman"/>
+                <w:b w:val="false"/>
+                <w:bCs w:val="false"/>
+                <w:sz w:val="20"/>
+                <w:szCs w:val="20"/>
+              </w:rPr>
+              <w:t xml:space="preserve">0,507</w:t>
+            </w:r>
+          </w:p>
+        </w:tc>
+        <w:tc>
+          <w:tcPr>
+            <w:tcW w:type="dxa" w:w="1126"/>
+            <w:tcBorders>
+              <w:top w:val="single" w:color="888888" w:sz="4"/>
+              <w:left w:val="single" w:color="888888" w:sz="4"/>
+              <w:bottom w:val="single" w:color="888888" w:sz="4"/>
+              <w:right w:val="single" w:color="888888" w:sz="4"/>
+            </w:tcBorders>
+            <w:tcMar>
+              <w:top w:type="dxa" w:w="60"/>
+              <w:left w:type="dxa" w:w="100"/>
+              <w:bottom w:type="dxa" w:w="60"/>
+              <w:right w:type="dxa" w:w="100"/>
+            </w:tcMar>
+          </w:tcPr>
+          <w:p>
+            <w:pPr>
+              <w:jc w:val="center"/>
+            </w:pPr>
+            <w:r>
+              <w:rPr>
+                <w:rFonts w:ascii="Times New Roman" w:cs="Times New Roman" w:eastAsia="Times New Roman" w:hAnsi="Times New Roman"/>
+                <w:b w:val="false"/>
+                <w:bCs w:val="false"/>
+                <w:sz w:val="20"/>
+                <w:szCs w:val="20"/>
+              </w:rPr>
+              <w:t xml:space="preserve">0,648</w:t>
             </w:r>
           </w:p>
         </w:tc>
@@ -3956,7 +4263,7 @@
         </w:trPr>
         <w:tc>
           <w:tcPr>
-            <w:tcW w:type="dxa" w:w="3300"/>
+            <w:tcW w:type="dxa" w:w="2500"/>
             <w:tcBorders>
               <w:top w:val="single" w:color="888888" w:sz="4"/>
               <w:left w:val="single" w:color="888888" w:sz="4"/>
@@ -3988,6 +4295,38 @@
         </w:tc>
         <w:tc>
           <w:tcPr>
+            <w:tcW w:type="dxa" w:w="900"/>
+            <w:tcBorders>
+              <w:top w:val="single" w:color="888888" w:sz="4"/>
+              <w:left w:val="single" w:color="888888" w:sz="4"/>
+              <w:bottom w:val="single" w:color="888888" w:sz="4"/>
+              <w:right w:val="single" w:color="888888" w:sz="4"/>
+            </w:tcBorders>
+            <w:tcMar>
+              <w:top w:type="dxa" w:w="60"/>
+              <w:left w:type="dxa" w:w="100"/>
+              <w:bottom w:type="dxa" w:w="60"/>
+              <w:right w:type="dxa" w:w="100"/>
+            </w:tcMar>
+          </w:tcPr>
+          <w:p>
+            <w:pPr>
+              <w:jc w:val="center"/>
+            </w:pPr>
+            <w:r>
+              <w:rPr>
+                <w:rFonts w:ascii="Times New Roman" w:cs="Times New Roman" w:eastAsia="Times New Roman" w:hAnsi="Times New Roman"/>
+                <w:b w:val="false"/>
+                <w:bCs w:val="false"/>
+                <w:sz w:val="20"/>
+                <w:szCs w:val="20"/>
+              </w:rPr>
+              <w:t xml:space="preserve">1242</w:t>
+            </w:r>
+          </w:p>
+        </w:tc>
+        <w:tc>
+          <w:tcPr>
             <w:tcW w:type="dxa" w:w="1100"/>
             <w:tcBorders>
               <w:top w:val="single" w:color="888888" w:sz="4"/>
@@ -4014,103 +4353,135 @@
                 <w:sz w:val="20"/>
                 <w:szCs w:val="20"/>
               </w:rPr>
-              <w:t xml:space="preserve">—</w:t>
-            </w:r>
-          </w:p>
-        </w:tc>
-        <w:tc>
-          <w:tcPr>
-            <w:tcW w:type="dxa" w:w="1450"/>
-            <w:tcBorders>
-              <w:top w:val="single" w:color="888888" w:sz="4"/>
-              <w:left w:val="single" w:color="888888" w:sz="4"/>
-              <w:bottom w:val="single" w:color="888888" w:sz="4"/>
-              <w:right w:val="single" w:color="888888" w:sz="4"/>
-            </w:tcBorders>
-            <w:tcMar>
-              <w:top w:type="dxa" w:w="60"/>
-              <w:left w:type="dxa" w:w="100"/>
-              <w:bottom w:type="dxa" w:w="60"/>
-              <w:right w:type="dxa" w:w="100"/>
-            </w:tcMar>
-          </w:tcPr>
-          <w:p>
-            <w:pPr>
-              <w:jc w:val="center"/>
-            </w:pPr>
-            <w:r>
-              <w:rPr>
-                <w:rFonts w:ascii="Times New Roman" w:cs="Times New Roman" w:eastAsia="Times New Roman" w:hAnsi="Times New Roman"/>
-                <w:b w:val="false"/>
-                <w:bCs w:val="false"/>
-                <w:sz w:val="20"/>
-                <w:szCs w:val="20"/>
-              </w:rPr>
-              <w:t xml:space="preserve">—</w:t>
-            </w:r>
-          </w:p>
-        </w:tc>
-        <w:tc>
-          <w:tcPr>
-            <w:tcW w:type="dxa" w:w="1450"/>
-            <w:tcBorders>
-              <w:top w:val="single" w:color="888888" w:sz="4"/>
-              <w:left w:val="single" w:color="888888" w:sz="4"/>
-              <w:bottom w:val="single" w:color="888888" w:sz="4"/>
-              <w:right w:val="single" w:color="888888" w:sz="4"/>
-            </w:tcBorders>
-            <w:tcMar>
-              <w:top w:type="dxa" w:w="60"/>
-              <w:left w:type="dxa" w:w="100"/>
-              <w:bottom w:type="dxa" w:w="60"/>
-              <w:right w:type="dxa" w:w="100"/>
-            </w:tcMar>
-          </w:tcPr>
-          <w:p>
-            <w:pPr>
-              <w:jc w:val="center"/>
-            </w:pPr>
-            <w:r>
-              <w:rPr>
-                <w:rFonts w:ascii="Times New Roman" w:cs="Times New Roman" w:eastAsia="Times New Roman" w:hAnsi="Times New Roman"/>
-                <w:b w:val="false"/>
-                <w:bCs w:val="false"/>
-                <w:sz w:val="20"/>
-                <w:szCs w:val="20"/>
-              </w:rPr>
-              <w:t xml:space="preserve">—</w:t>
-            </w:r>
-          </w:p>
-        </w:tc>
-        <w:tc>
-          <w:tcPr>
-            <w:tcW w:type="dxa" w:w="2060"/>
-            <w:tcBorders>
-              <w:top w:val="single" w:color="888888" w:sz="4"/>
-              <w:left w:val="single" w:color="888888" w:sz="4"/>
-              <w:bottom w:val="single" w:color="888888" w:sz="4"/>
-              <w:right w:val="single" w:color="888888" w:sz="4"/>
-            </w:tcBorders>
-            <w:tcMar>
-              <w:top w:type="dxa" w:w="60"/>
-              <w:left w:type="dxa" w:w="100"/>
-              <w:bottom w:type="dxa" w:w="60"/>
-              <w:right w:type="dxa" w:w="100"/>
-            </w:tcMar>
-          </w:tcPr>
-          <w:p>
-            <w:pPr>
-              <w:jc w:val="center"/>
-            </w:pPr>
-            <w:r>
-              <w:rPr>
-                <w:rFonts w:ascii="Times New Roman" w:cs="Times New Roman" w:eastAsia="Times New Roman" w:hAnsi="Times New Roman"/>
-                <w:b w:val="false"/>
-                <w:bCs w:val="false"/>
-                <w:sz w:val="20"/>
-                <w:szCs w:val="20"/>
-              </w:rPr>
-              <w:t xml:space="preserve">—</w:t>
+              <w:t xml:space="preserve">0,754</w:t>
+            </w:r>
+          </w:p>
+        </w:tc>
+        <w:tc>
+          <w:tcPr>
+            <w:tcW w:type="dxa" w:w="1100"/>
+            <w:tcBorders>
+              <w:top w:val="single" w:color="888888" w:sz="4"/>
+              <w:left w:val="single" w:color="888888" w:sz="4"/>
+              <w:bottom w:val="single" w:color="888888" w:sz="4"/>
+              <w:right w:val="single" w:color="888888" w:sz="4"/>
+            </w:tcBorders>
+            <w:tcMar>
+              <w:top w:type="dxa" w:w="60"/>
+              <w:left w:type="dxa" w:w="100"/>
+              <w:bottom w:type="dxa" w:w="60"/>
+              <w:right w:type="dxa" w:w="100"/>
+            </w:tcMar>
+          </w:tcPr>
+          <w:p>
+            <w:pPr>
+              <w:jc w:val="center"/>
+            </w:pPr>
+            <w:r>
+              <w:rPr>
+                <w:rFonts w:ascii="Times New Roman" w:cs="Times New Roman" w:eastAsia="Times New Roman" w:hAnsi="Times New Roman"/>
+                <w:b w:val="false"/>
+                <w:bCs w:val="false"/>
+                <w:sz w:val="20"/>
+                <w:szCs w:val="20"/>
+              </w:rPr>
+              <w:t xml:space="preserve">0,676</w:t>
+            </w:r>
+          </w:p>
+        </w:tc>
+        <w:tc>
+          <w:tcPr>
+            <w:tcW w:type="dxa" w:w="1150"/>
+            <w:tcBorders>
+              <w:top w:val="single" w:color="888888" w:sz="4"/>
+              <w:left w:val="single" w:color="888888" w:sz="4"/>
+              <w:bottom w:val="single" w:color="888888" w:sz="4"/>
+              <w:right w:val="single" w:color="888888" w:sz="4"/>
+            </w:tcBorders>
+            <w:tcMar>
+              <w:top w:type="dxa" w:w="60"/>
+              <w:left w:type="dxa" w:w="100"/>
+              <w:bottom w:type="dxa" w:w="60"/>
+              <w:right w:type="dxa" w:w="100"/>
+            </w:tcMar>
+          </w:tcPr>
+          <w:p>
+            <w:pPr>
+              <w:jc w:val="center"/>
+            </w:pPr>
+            <w:r>
+              <w:rPr>
+                <w:rFonts w:ascii="Times New Roman" w:cs="Times New Roman" w:eastAsia="Times New Roman" w:hAnsi="Times New Roman"/>
+                <w:b w:val="false"/>
+                <w:bCs w:val="false"/>
+                <w:sz w:val="20"/>
+                <w:szCs w:val="20"/>
+              </w:rPr>
+              <w:t xml:space="preserve">0,882</w:t>
+            </w:r>
+          </w:p>
+        </w:tc>
+        <w:tc>
+          <w:tcPr>
+            <w:tcW w:type="dxa" w:w="1150"/>
+            <w:tcBorders>
+              <w:top w:val="single" w:color="888888" w:sz="4"/>
+              <w:left w:val="single" w:color="888888" w:sz="4"/>
+              <w:bottom w:val="single" w:color="888888" w:sz="4"/>
+              <w:right w:val="single" w:color="888888" w:sz="4"/>
+            </w:tcBorders>
+            <w:tcMar>
+              <w:top w:type="dxa" w:w="60"/>
+              <w:left w:type="dxa" w:w="100"/>
+              <w:bottom w:type="dxa" w:w="60"/>
+              <w:right w:type="dxa" w:w="100"/>
+            </w:tcMar>
+          </w:tcPr>
+          <w:p>
+            <w:pPr>
+              <w:jc w:val="center"/>
+            </w:pPr>
+            <w:r>
+              <w:rPr>
+                <w:rFonts w:ascii="Times New Roman" w:cs="Times New Roman" w:eastAsia="Times New Roman" w:hAnsi="Times New Roman"/>
+                <w:b w:val="false"/>
+                <w:bCs w:val="false"/>
+                <w:sz w:val="20"/>
+                <w:szCs w:val="20"/>
+              </w:rPr>
+              <w:t xml:space="preserve">0,471</w:t>
+            </w:r>
+          </w:p>
+        </w:tc>
+        <w:tc>
+          <w:tcPr>
+            <w:tcW w:type="dxa" w:w="1126"/>
+            <w:tcBorders>
+              <w:top w:val="single" w:color="888888" w:sz="4"/>
+              <w:left w:val="single" w:color="888888" w:sz="4"/>
+              <w:bottom w:val="single" w:color="888888" w:sz="4"/>
+              <w:right w:val="single" w:color="888888" w:sz="4"/>
+            </w:tcBorders>
+            <w:tcMar>
+              <w:top w:type="dxa" w:w="60"/>
+              <w:left w:type="dxa" w:w="100"/>
+              <w:bottom w:type="dxa" w:w="60"/>
+              <w:right w:type="dxa" w:w="100"/>
+            </w:tcMar>
+          </w:tcPr>
+          <w:p>
+            <w:pPr>
+              <w:jc w:val="center"/>
+            </w:pPr>
+            <w:r>
+              <w:rPr>
+                <w:rFonts w:ascii="Times New Roman" w:cs="Times New Roman" w:eastAsia="Times New Roman" w:hAnsi="Times New Roman"/>
+                <w:b w:val="false"/>
+                <w:bCs w:val="false"/>
+                <w:sz w:val="20"/>
+                <w:szCs w:val="20"/>
+              </w:rPr>
+              <w:t xml:space="preserve">0,675</w:t>
             </w:r>
           </w:p>
         </w:tc>
@@ -4129,24 +4500,1490 @@
           <w:sz w:val="20"/>
           <w:szCs w:val="20"/>
         </w:rPr>
-        <w:t xml:space="preserve">Tabla 5. Comparación de variantes en validación (a completar con results/ablation_val.csv).</w:t>
+        <w:t xml:space="preserve">Tabla 5. Comparación de variantes en validación (244 imágenes; 29 de araña roja). Una sola corrida por variante.</w:t>
       </w:r>
     </w:p>
     <w:p>
       <w:pPr>
-        <w:spacing w:after="160"/>
+        <w:spacing w:after="160" w:line="300"/>
+        <w:jc w:val="both"/>
+      </w:pPr>
+      <w:r>
+        <w:rPr>
+          <w:rFonts w:ascii="Times New Roman" w:cs="Times New Roman" w:eastAsia="Times New Roman" w:hAnsi="Times New Roman"/>
+          <w:sz w:val="24"/>
+          <w:szCs w:val="24"/>
+        </w:rPr>
+        <w:t xml:space="preserve">Los pesos de clase por sí solos empeoraron el desempeño global (exactitud de 0,766 a 0,639 y F1 macro de 0,636 a 0,562) con una mejora marginal en araña roja (F1 de 0,324 a 0,340). El ajuste fino elevó el F1 de araña roja a 0,444 a costa de la exactitud (0,709). Añadir 150 imágenes de la clase minoritaria produjo los mayores F1 macro: 0,666 con GAN y 0,676 con sobremuestreo de imágenes reales. La GAN obtuvo el mayor F1 en araña roja (0,507 frente a 0,471), pero el sobremuestreo real obtuvo mayor exactitud y F1 macro. Por F1 macro en validación se eligió la variante 4b.</w:t>
+      </w:r>
+    </w:p>
+    <w:p>
+      <w:pPr>
+        <w:pStyle w:val="Heading2"/>
+        <w:spacing w:after="100" w:before="200"/>
       </w:pPr>
       <w:r>
         <w:rPr>
           <w:rFonts w:ascii="Times New Roman" w:cs="Times New Roman" w:eastAsia="Times New Roman" w:hAnsi="Times New Roman"/>
           <w:b/>
           <w:bCs/>
+          <w:i/>
+          <w:iCs/>
           <w:sz w:val="24"/>
           <w:szCs w:val="24"/>
-          <w:highlight w:val="yellow"/>
-          <w:highlightCs w:val="yellow"/>
         </w:rPr>
-        <w:t xml:space="preserve">[PENDIENTE: completar la Tabla 5 y añadir aquí el reporte de clasificación y la matriz de confusión finales en prueba (results/test_report.txt) una vez ejecutada la sección de mejoras del notebook en Colab. No se incluyen cifras hasta tenerlas.]</w:t>
+        <w:t xml:space="preserve">4.5 Evaluación final en prueba</w:t>
+      </w:r>
+    </w:p>
+    <w:p>
+      <w:pPr>
+        <w:spacing w:after="160" w:line="300"/>
+        <w:jc w:val="both"/>
+      </w:pPr>
+      <w:r>
+        <w:rPr>
+          <w:rFonts w:ascii="Times New Roman" w:cs="Times New Roman" w:eastAsia="Times New Roman" w:hAnsi="Times New Roman"/>
+          <w:sz w:val="24"/>
+          <w:szCs w:val="24"/>
+        </w:rPr>
+        <w:t xml:space="preserve">La variante elegida (4b) se evaluó una única vez sobre el conjunto de prueba (224 imágenes): exactitud de 0,69 y F1 macro de 0,60 (Tablas 6 y 7). La variante con GAN no se evaluó en prueba, por no haber sido la elegida en validación.</w:t>
+      </w:r>
+    </w:p>
+    <w:tbl>
+      <w:tblPr>
+        <w:tblW w:type="dxa" w:w="9026"/>
+        <w:tblBorders>
+          <w:top w:val="single" w:color="auto" w:sz="4"/>
+          <w:left w:val="single" w:color="auto" w:sz="4"/>
+          <w:bottom w:val="single" w:color="auto" w:sz="4"/>
+          <w:right w:val="single" w:color="auto" w:sz="4"/>
+          <w:insideH w:val="single" w:color="auto" w:sz="4"/>
+          <w:insideV w:val="single" w:color="auto" w:sz="4"/>
+        </w:tblBorders>
+      </w:tblPr>
+      <w:tblGrid>
+        <w:gridCol w:w="3000"/>
+        <w:gridCol w:w="1500"/>
+        <w:gridCol w:w="1500"/>
+        <w:gridCol w:w="1500"/>
+        <w:gridCol w:w="1526"/>
+      </w:tblGrid>
+      <w:tr>
+        <w:trPr>
+          <w:tblHeader/>
+        </w:trPr>
+        <w:tc>
+          <w:tcPr>
+            <w:tcW w:type="dxa" w:w="3000"/>
+            <w:tcBorders>
+              <w:top w:val="single" w:color="888888" w:sz="4"/>
+              <w:left w:val="single" w:color="888888" w:sz="4"/>
+              <w:bottom w:val="single" w:color="888888" w:sz="4"/>
+              <w:right w:val="single" w:color="888888" w:sz="4"/>
+            </w:tcBorders>
+            <w:shd w:fill="E7EEF6" w:color="auto" w:val="clear"/>
+            <w:tcMar>
+              <w:top w:type="dxa" w:w="60"/>
+              <w:left w:type="dxa" w:w="100"/>
+              <w:bottom w:type="dxa" w:w="60"/>
+              <w:right w:type="dxa" w:w="100"/>
+            </w:tcMar>
+          </w:tcPr>
+          <w:p>
+            <w:pPr>
+              <w:jc w:val="left"/>
+            </w:pPr>
+            <w:r>
+              <w:rPr>
+                <w:rFonts w:ascii="Times New Roman" w:cs="Times New Roman" w:eastAsia="Times New Roman" w:hAnsi="Times New Roman"/>
+                <w:b/>
+                <w:bCs/>
+                <w:sz w:val="20"/>
+                <w:szCs w:val="20"/>
+              </w:rPr>
+              <w:t xml:space="preserve">Clase</w:t>
+            </w:r>
+          </w:p>
+        </w:tc>
+        <w:tc>
+          <w:tcPr>
+            <w:tcW w:type="dxa" w:w="1500"/>
+            <w:tcBorders>
+              <w:top w:val="single" w:color="888888" w:sz="4"/>
+              <w:left w:val="single" w:color="888888" w:sz="4"/>
+              <w:bottom w:val="single" w:color="888888" w:sz="4"/>
+              <w:right w:val="single" w:color="888888" w:sz="4"/>
+            </w:tcBorders>
+            <w:shd w:fill="E7EEF6" w:color="auto" w:val="clear"/>
+            <w:tcMar>
+              <w:top w:type="dxa" w:w="60"/>
+              <w:left w:type="dxa" w:w="100"/>
+              <w:bottom w:type="dxa" w:w="60"/>
+              <w:right w:type="dxa" w:w="100"/>
+            </w:tcMar>
+          </w:tcPr>
+          <w:p>
+            <w:pPr>
+              <w:jc w:val="center"/>
+            </w:pPr>
+            <w:r>
+              <w:rPr>
+                <w:rFonts w:ascii="Times New Roman" w:cs="Times New Roman" w:eastAsia="Times New Roman" w:hAnsi="Times New Roman"/>
+                <w:b/>
+                <w:bCs/>
+                <w:sz w:val="20"/>
+                <w:szCs w:val="20"/>
+              </w:rPr>
+              <w:t xml:space="preserve">Precisión</w:t>
+            </w:r>
+          </w:p>
+        </w:tc>
+        <w:tc>
+          <w:tcPr>
+            <w:tcW w:type="dxa" w:w="1500"/>
+            <w:tcBorders>
+              <w:top w:val="single" w:color="888888" w:sz="4"/>
+              <w:left w:val="single" w:color="888888" w:sz="4"/>
+              <w:bottom w:val="single" w:color="888888" w:sz="4"/>
+              <w:right w:val="single" w:color="888888" w:sz="4"/>
+            </w:tcBorders>
+            <w:shd w:fill="E7EEF6" w:color="auto" w:val="clear"/>
+            <w:tcMar>
+              <w:top w:type="dxa" w:w="60"/>
+              <w:left w:type="dxa" w:w="100"/>
+              <w:bottom w:type="dxa" w:w="60"/>
+              <w:right w:type="dxa" w:w="100"/>
+            </w:tcMar>
+          </w:tcPr>
+          <w:p>
+            <w:pPr>
+              <w:jc w:val="center"/>
+            </w:pPr>
+            <w:r>
+              <w:rPr>
+                <w:rFonts w:ascii="Times New Roman" w:cs="Times New Roman" w:eastAsia="Times New Roman" w:hAnsi="Times New Roman"/>
+                <w:b/>
+                <w:bCs/>
+                <w:sz w:val="20"/>
+                <w:szCs w:val="20"/>
+              </w:rPr>
+              <w:t xml:space="preserve">Recall</w:t>
+            </w:r>
+          </w:p>
+        </w:tc>
+        <w:tc>
+          <w:tcPr>
+            <w:tcW w:type="dxa" w:w="1500"/>
+            <w:tcBorders>
+              <w:top w:val="single" w:color="888888" w:sz="4"/>
+              <w:left w:val="single" w:color="888888" w:sz="4"/>
+              <w:bottom w:val="single" w:color="888888" w:sz="4"/>
+              <w:right w:val="single" w:color="888888" w:sz="4"/>
+            </w:tcBorders>
+            <w:shd w:fill="E7EEF6" w:color="auto" w:val="clear"/>
+            <w:tcMar>
+              <w:top w:type="dxa" w:w="60"/>
+              <w:left w:type="dxa" w:w="100"/>
+              <w:bottom w:type="dxa" w:w="60"/>
+              <w:right w:type="dxa" w:w="100"/>
+            </w:tcMar>
+          </w:tcPr>
+          <w:p>
+            <w:pPr>
+              <w:jc w:val="center"/>
+            </w:pPr>
+            <w:r>
+              <w:rPr>
+                <w:rFonts w:ascii="Times New Roman" w:cs="Times New Roman" w:eastAsia="Times New Roman" w:hAnsi="Times New Roman"/>
+                <w:b/>
+                <w:bCs/>
+                <w:sz w:val="20"/>
+                <w:szCs w:val="20"/>
+              </w:rPr>
+              <w:t xml:space="preserve">F1</w:t>
+            </w:r>
+          </w:p>
+        </w:tc>
+        <w:tc>
+          <w:tcPr>
+            <w:tcW w:type="dxa" w:w="1526"/>
+            <w:tcBorders>
+              <w:top w:val="single" w:color="888888" w:sz="4"/>
+              <w:left w:val="single" w:color="888888" w:sz="4"/>
+              <w:bottom w:val="single" w:color="888888" w:sz="4"/>
+              <w:right w:val="single" w:color="888888" w:sz="4"/>
+            </w:tcBorders>
+            <w:shd w:fill="E7EEF6" w:color="auto" w:val="clear"/>
+            <w:tcMar>
+              <w:top w:type="dxa" w:w="60"/>
+              <w:left w:type="dxa" w:w="100"/>
+              <w:bottom w:type="dxa" w:w="60"/>
+              <w:right w:type="dxa" w:w="100"/>
+            </w:tcMar>
+          </w:tcPr>
+          <w:p>
+            <w:pPr>
+              <w:jc w:val="center"/>
+            </w:pPr>
+            <w:r>
+              <w:rPr>
+                <w:rFonts w:ascii="Times New Roman" w:cs="Times New Roman" w:eastAsia="Times New Roman" w:hAnsi="Times New Roman"/>
+                <w:b/>
+                <w:bCs/>
+                <w:sz w:val="20"/>
+                <w:szCs w:val="20"/>
+              </w:rPr>
+              <w:t xml:space="preserve">Soporte</w:t>
+            </w:r>
+          </w:p>
+        </w:tc>
+      </w:tr>
+      <w:tr>
+        <w:trPr>
+          <w:tblHeader w:val="false"/>
+        </w:trPr>
+        <w:tc>
+          <w:tcPr>
+            <w:tcW w:type="dxa" w:w="3000"/>
+            <w:tcBorders>
+              <w:top w:val="single" w:color="888888" w:sz="4"/>
+              <w:left w:val="single" w:color="888888" w:sz="4"/>
+              <w:bottom w:val="single" w:color="888888" w:sz="4"/>
+              <w:right w:val="single" w:color="888888" w:sz="4"/>
+            </w:tcBorders>
+            <w:tcMar>
+              <w:top w:type="dxa" w:w="60"/>
+              <w:left w:type="dxa" w:w="100"/>
+              <w:bottom w:type="dxa" w:w="60"/>
+              <w:right w:type="dxa" w:w="100"/>
+            </w:tcMar>
+          </w:tcPr>
+          <w:p>
+            <w:pPr>
+              <w:jc w:val="left"/>
+            </w:pPr>
+            <w:r>
+              <w:rPr>
+                <w:rFonts w:ascii="Times New Roman" w:cs="Times New Roman" w:eastAsia="Times New Roman" w:hAnsi="Times New Roman"/>
+                <w:b w:val="false"/>
+                <w:bCs w:val="false"/>
+                <w:sz w:val="20"/>
+                <w:szCs w:val="20"/>
+              </w:rPr>
+              <w:t xml:space="preserve">Sana</w:t>
+            </w:r>
+          </w:p>
+        </w:tc>
+        <w:tc>
+          <w:tcPr>
+            <w:tcW w:type="dxa" w:w="1500"/>
+            <w:tcBorders>
+              <w:top w:val="single" w:color="888888" w:sz="4"/>
+              <w:left w:val="single" w:color="888888" w:sz="4"/>
+              <w:bottom w:val="single" w:color="888888" w:sz="4"/>
+              <w:right w:val="single" w:color="888888" w:sz="4"/>
+            </w:tcBorders>
+            <w:tcMar>
+              <w:top w:type="dxa" w:w="60"/>
+              <w:left w:type="dxa" w:w="100"/>
+              <w:bottom w:type="dxa" w:w="60"/>
+              <w:right w:type="dxa" w:w="100"/>
+            </w:tcMar>
+          </w:tcPr>
+          <w:p>
+            <w:pPr>
+              <w:jc w:val="center"/>
+            </w:pPr>
+            <w:r>
+              <w:rPr>
+                <w:rFonts w:ascii="Times New Roman" w:cs="Times New Roman" w:eastAsia="Times New Roman" w:hAnsi="Times New Roman"/>
+                <w:b w:val="false"/>
+                <w:bCs w:val="false"/>
+                <w:sz w:val="20"/>
+                <w:szCs w:val="20"/>
+              </w:rPr>
+              <w:t xml:space="preserve">0,78</w:t>
+            </w:r>
+          </w:p>
+        </w:tc>
+        <w:tc>
+          <w:tcPr>
+            <w:tcW w:type="dxa" w:w="1500"/>
+            <w:tcBorders>
+              <w:top w:val="single" w:color="888888" w:sz="4"/>
+              <w:left w:val="single" w:color="888888" w:sz="4"/>
+              <w:bottom w:val="single" w:color="888888" w:sz="4"/>
+              <w:right w:val="single" w:color="888888" w:sz="4"/>
+            </w:tcBorders>
+            <w:tcMar>
+              <w:top w:type="dxa" w:w="60"/>
+              <w:left w:type="dxa" w:w="100"/>
+              <w:bottom w:type="dxa" w:w="60"/>
+              <w:right w:type="dxa" w:w="100"/>
+            </w:tcMar>
+          </w:tcPr>
+          <w:p>
+            <w:pPr>
+              <w:jc w:val="center"/>
+            </w:pPr>
+            <w:r>
+              <w:rPr>
+                <w:rFonts w:ascii="Times New Roman" w:cs="Times New Roman" w:eastAsia="Times New Roman" w:hAnsi="Times New Roman"/>
+                <w:b w:val="false"/>
+                <w:bCs w:val="false"/>
+                <w:sz w:val="20"/>
+                <w:szCs w:val="20"/>
+              </w:rPr>
+              <w:t xml:space="preserve">0,83</w:t>
+            </w:r>
+          </w:p>
+        </w:tc>
+        <w:tc>
+          <w:tcPr>
+            <w:tcW w:type="dxa" w:w="1500"/>
+            <w:tcBorders>
+              <w:top w:val="single" w:color="888888" w:sz="4"/>
+              <w:left w:val="single" w:color="888888" w:sz="4"/>
+              <w:bottom w:val="single" w:color="888888" w:sz="4"/>
+              <w:right w:val="single" w:color="888888" w:sz="4"/>
+            </w:tcBorders>
+            <w:tcMar>
+              <w:top w:type="dxa" w:w="60"/>
+              <w:left w:type="dxa" w:w="100"/>
+              <w:bottom w:type="dxa" w:w="60"/>
+              <w:right w:type="dxa" w:w="100"/>
+            </w:tcMar>
+          </w:tcPr>
+          <w:p>
+            <w:pPr>
+              <w:jc w:val="center"/>
+            </w:pPr>
+            <w:r>
+              <w:rPr>
+                <w:rFonts w:ascii="Times New Roman" w:cs="Times New Roman" w:eastAsia="Times New Roman" w:hAnsi="Times New Roman"/>
+                <w:b w:val="false"/>
+                <w:bCs w:val="false"/>
+                <w:sz w:val="20"/>
+                <w:szCs w:val="20"/>
+              </w:rPr>
+              <w:t xml:space="preserve">0,81</w:t>
+            </w:r>
+          </w:p>
+        </w:tc>
+        <w:tc>
+          <w:tcPr>
+            <w:tcW w:type="dxa" w:w="1526"/>
+            <w:tcBorders>
+              <w:top w:val="single" w:color="888888" w:sz="4"/>
+              <w:left w:val="single" w:color="888888" w:sz="4"/>
+              <w:bottom w:val="single" w:color="888888" w:sz="4"/>
+              <w:right w:val="single" w:color="888888" w:sz="4"/>
+            </w:tcBorders>
+            <w:tcMar>
+              <w:top w:type="dxa" w:w="60"/>
+              <w:left w:type="dxa" w:w="100"/>
+              <w:bottom w:type="dxa" w:w="60"/>
+              <w:right w:type="dxa" w:w="100"/>
+            </w:tcMar>
+          </w:tcPr>
+          <w:p>
+            <w:pPr>
+              <w:jc w:val="center"/>
+            </w:pPr>
+            <w:r>
+              <w:rPr>
+                <w:rFonts w:ascii="Times New Roman" w:cs="Times New Roman" w:eastAsia="Times New Roman" w:hAnsi="Times New Roman"/>
+                <w:b w:val="false"/>
+                <w:bCs w:val="false"/>
+                <w:sz w:val="20"/>
+                <w:szCs w:val="20"/>
+              </w:rPr>
+              <w:t xml:space="preserve">112</w:t>
+            </w:r>
+          </w:p>
+        </w:tc>
+      </w:tr>
+      <w:tr>
+        <w:trPr>
+          <w:tblHeader w:val="false"/>
+        </w:trPr>
+        <w:tc>
+          <w:tcPr>
+            <w:tcW w:type="dxa" w:w="3000"/>
+            <w:tcBorders>
+              <w:top w:val="single" w:color="888888" w:sz="4"/>
+              <w:left w:val="single" w:color="888888" w:sz="4"/>
+              <w:bottom w:val="single" w:color="888888" w:sz="4"/>
+              <w:right w:val="single" w:color="888888" w:sz="4"/>
+            </w:tcBorders>
+            <w:tcMar>
+              <w:top w:type="dxa" w:w="60"/>
+              <w:left w:type="dxa" w:w="100"/>
+              <w:bottom w:type="dxa" w:w="60"/>
+              <w:right w:type="dxa" w:w="100"/>
+            </w:tcMar>
+          </w:tcPr>
+          <w:p>
+            <w:pPr>
+              <w:jc w:val="left"/>
+            </w:pPr>
+            <w:r>
+              <w:rPr>
+                <w:rFonts w:ascii="Times New Roman" w:cs="Times New Roman" w:eastAsia="Times New Roman" w:hAnsi="Times New Roman"/>
+                <w:b w:val="false"/>
+                <w:bCs w:val="false"/>
+                <w:sz w:val="20"/>
+                <w:szCs w:val="20"/>
+              </w:rPr>
+              <w:t xml:space="preserve">Araña roja</w:t>
+            </w:r>
+          </w:p>
+        </w:tc>
+        <w:tc>
+          <w:tcPr>
+            <w:tcW w:type="dxa" w:w="1500"/>
+            <w:tcBorders>
+              <w:top w:val="single" w:color="888888" w:sz="4"/>
+              <w:left w:val="single" w:color="888888" w:sz="4"/>
+              <w:bottom w:val="single" w:color="888888" w:sz="4"/>
+              <w:right w:val="single" w:color="888888" w:sz="4"/>
+            </w:tcBorders>
+            <w:tcMar>
+              <w:top w:type="dxa" w:w="60"/>
+              <w:left w:type="dxa" w:w="100"/>
+              <w:bottom w:type="dxa" w:w="60"/>
+              <w:right w:type="dxa" w:w="100"/>
+            </w:tcMar>
+          </w:tcPr>
+          <w:p>
+            <w:pPr>
+              <w:jc w:val="center"/>
+            </w:pPr>
+            <w:r>
+              <w:rPr>
+                <w:rFonts w:ascii="Times New Roman" w:cs="Times New Roman" w:eastAsia="Times New Roman" w:hAnsi="Times New Roman"/>
+                <w:b w:val="false"/>
+                <w:bCs w:val="false"/>
+                <w:sz w:val="20"/>
+                <w:szCs w:val="20"/>
+              </w:rPr>
+              <w:t xml:space="preserve">0,28</w:t>
+            </w:r>
+          </w:p>
+        </w:tc>
+        <w:tc>
+          <w:tcPr>
+            <w:tcW w:type="dxa" w:w="1500"/>
+            <w:tcBorders>
+              <w:top w:val="single" w:color="888888" w:sz="4"/>
+              <w:left w:val="single" w:color="888888" w:sz="4"/>
+              <w:bottom w:val="single" w:color="888888" w:sz="4"/>
+              <w:right w:val="single" w:color="888888" w:sz="4"/>
+            </w:tcBorders>
+            <w:tcMar>
+              <w:top w:type="dxa" w:w="60"/>
+              <w:left w:type="dxa" w:w="100"/>
+              <w:bottom w:type="dxa" w:w="60"/>
+              <w:right w:type="dxa" w:w="100"/>
+            </w:tcMar>
+          </w:tcPr>
+          <w:p>
+            <w:pPr>
+              <w:jc w:val="center"/>
+            </w:pPr>
+            <w:r>
+              <w:rPr>
+                <w:rFonts w:ascii="Times New Roman" w:cs="Times New Roman" w:eastAsia="Times New Roman" w:hAnsi="Times New Roman"/>
+                <w:b w:val="false"/>
+                <w:bCs w:val="false"/>
+                <w:sz w:val="20"/>
+                <w:szCs w:val="20"/>
+              </w:rPr>
+              <w:t xml:space="preserve">0,52</w:t>
+            </w:r>
+          </w:p>
+        </w:tc>
+        <w:tc>
+          <w:tcPr>
+            <w:tcW w:type="dxa" w:w="1500"/>
+            <w:tcBorders>
+              <w:top w:val="single" w:color="888888" w:sz="4"/>
+              <w:left w:val="single" w:color="888888" w:sz="4"/>
+              <w:bottom w:val="single" w:color="888888" w:sz="4"/>
+              <w:right w:val="single" w:color="888888" w:sz="4"/>
+            </w:tcBorders>
+            <w:tcMar>
+              <w:top w:type="dxa" w:w="60"/>
+              <w:left w:type="dxa" w:w="100"/>
+              <w:bottom w:type="dxa" w:w="60"/>
+              <w:right w:type="dxa" w:w="100"/>
+            </w:tcMar>
+          </w:tcPr>
+          <w:p>
+            <w:pPr>
+              <w:jc w:val="center"/>
+            </w:pPr>
+            <w:r>
+              <w:rPr>
+                <w:rFonts w:ascii="Times New Roman" w:cs="Times New Roman" w:eastAsia="Times New Roman" w:hAnsi="Times New Roman"/>
+                <w:b w:val="false"/>
+                <w:bCs w:val="false"/>
+                <w:sz w:val="20"/>
+                <w:szCs w:val="20"/>
+              </w:rPr>
+              <w:t xml:space="preserve">0,36</w:t>
+            </w:r>
+          </w:p>
+        </w:tc>
+        <w:tc>
+          <w:tcPr>
+            <w:tcW w:type="dxa" w:w="1526"/>
+            <w:tcBorders>
+              <w:top w:val="single" w:color="888888" w:sz="4"/>
+              <w:left w:val="single" w:color="888888" w:sz="4"/>
+              <w:bottom w:val="single" w:color="888888" w:sz="4"/>
+              <w:right w:val="single" w:color="888888" w:sz="4"/>
+            </w:tcBorders>
+            <w:tcMar>
+              <w:top w:type="dxa" w:w="60"/>
+              <w:left w:type="dxa" w:w="100"/>
+              <w:bottom w:type="dxa" w:w="60"/>
+              <w:right w:type="dxa" w:w="100"/>
+            </w:tcMar>
+          </w:tcPr>
+          <w:p>
+            <w:pPr>
+              <w:jc w:val="center"/>
+            </w:pPr>
+            <w:r>
+              <w:rPr>
+                <w:rFonts w:ascii="Times New Roman" w:cs="Times New Roman" w:eastAsia="Times New Roman" w:hAnsi="Times New Roman"/>
+                <w:b w:val="false"/>
+                <w:bCs w:val="false"/>
+                <w:sz w:val="20"/>
+                <w:szCs w:val="20"/>
+              </w:rPr>
+              <w:t xml:space="preserve">21</w:t>
+            </w:r>
+          </w:p>
+        </w:tc>
+      </w:tr>
+      <w:tr>
+        <w:trPr>
+          <w:tblHeader w:val="false"/>
+        </w:trPr>
+        <w:tc>
+          <w:tcPr>
+            <w:tcW w:type="dxa" w:w="3000"/>
+            <w:tcBorders>
+              <w:top w:val="single" w:color="888888" w:sz="4"/>
+              <w:left w:val="single" w:color="888888" w:sz="4"/>
+              <w:bottom w:val="single" w:color="888888" w:sz="4"/>
+              <w:right w:val="single" w:color="888888" w:sz="4"/>
+            </w:tcBorders>
+            <w:tcMar>
+              <w:top w:type="dxa" w:w="60"/>
+              <w:left w:type="dxa" w:w="100"/>
+              <w:bottom w:type="dxa" w:w="60"/>
+              <w:right w:type="dxa" w:w="100"/>
+            </w:tcMar>
+          </w:tcPr>
+          <w:p>
+            <w:pPr>
+              <w:jc w:val="left"/>
+            </w:pPr>
+            <w:r>
+              <w:rPr>
+                <w:rFonts w:ascii="Times New Roman" w:cs="Times New Roman" w:eastAsia="Times New Roman" w:hAnsi="Times New Roman"/>
+                <w:b w:val="false"/>
+                <w:bCs w:val="false"/>
+                <w:sz w:val="20"/>
+                <w:szCs w:val="20"/>
+              </w:rPr>
+              <w:t xml:space="preserve">Roya</w:t>
+            </w:r>
+          </w:p>
+        </w:tc>
+        <w:tc>
+          <w:tcPr>
+            <w:tcW w:type="dxa" w:w="1500"/>
+            <w:tcBorders>
+              <w:top w:val="single" w:color="888888" w:sz="4"/>
+              <w:left w:val="single" w:color="888888" w:sz="4"/>
+              <w:bottom w:val="single" w:color="888888" w:sz="4"/>
+              <w:right w:val="single" w:color="888888" w:sz="4"/>
+            </w:tcBorders>
+            <w:tcMar>
+              <w:top w:type="dxa" w:w="60"/>
+              <w:left w:type="dxa" w:w="100"/>
+              <w:bottom w:type="dxa" w:w="60"/>
+              <w:right w:type="dxa" w:w="100"/>
+            </w:tcMar>
+          </w:tcPr>
+          <w:p>
+            <w:pPr>
+              <w:jc w:val="center"/>
+            </w:pPr>
+            <w:r>
+              <w:rPr>
+                <w:rFonts w:ascii="Times New Roman" w:cs="Times New Roman" w:eastAsia="Times New Roman" w:hAnsi="Times New Roman"/>
+                <w:b w:val="false"/>
+                <w:bCs w:val="false"/>
+                <w:sz w:val="20"/>
+                <w:szCs w:val="20"/>
+              </w:rPr>
+              <w:t xml:space="preserve">0,77</w:t>
+            </w:r>
+          </w:p>
+        </w:tc>
+        <w:tc>
+          <w:tcPr>
+            <w:tcW w:type="dxa" w:w="1500"/>
+            <w:tcBorders>
+              <w:top w:val="single" w:color="888888" w:sz="4"/>
+              <w:left w:val="single" w:color="888888" w:sz="4"/>
+              <w:bottom w:val="single" w:color="888888" w:sz="4"/>
+              <w:right w:val="single" w:color="888888" w:sz="4"/>
+            </w:tcBorders>
+            <w:tcMar>
+              <w:top w:type="dxa" w:w="60"/>
+              <w:left w:type="dxa" w:w="100"/>
+              <w:bottom w:type="dxa" w:w="60"/>
+              <w:right w:type="dxa" w:w="100"/>
+            </w:tcMar>
+          </w:tcPr>
+          <w:p>
+            <w:pPr>
+              <w:jc w:val="center"/>
+            </w:pPr>
+            <w:r>
+              <w:rPr>
+                <w:rFonts w:ascii="Times New Roman" w:cs="Times New Roman" w:eastAsia="Times New Roman" w:hAnsi="Times New Roman"/>
+                <w:b w:val="false"/>
+                <w:bCs w:val="false"/>
+                <w:sz w:val="20"/>
+                <w:szCs w:val="20"/>
+              </w:rPr>
+              <w:t xml:space="preserve">0,55</w:t>
+            </w:r>
+          </w:p>
+        </w:tc>
+        <w:tc>
+          <w:tcPr>
+            <w:tcW w:type="dxa" w:w="1500"/>
+            <w:tcBorders>
+              <w:top w:val="single" w:color="888888" w:sz="4"/>
+              <w:left w:val="single" w:color="888888" w:sz="4"/>
+              <w:bottom w:val="single" w:color="888888" w:sz="4"/>
+              <w:right w:val="single" w:color="888888" w:sz="4"/>
+            </w:tcBorders>
+            <w:tcMar>
+              <w:top w:type="dxa" w:w="60"/>
+              <w:left w:type="dxa" w:w="100"/>
+              <w:bottom w:type="dxa" w:w="60"/>
+              <w:right w:type="dxa" w:w="100"/>
+            </w:tcMar>
+          </w:tcPr>
+          <w:p>
+            <w:pPr>
+              <w:jc w:val="center"/>
+            </w:pPr>
+            <w:r>
+              <w:rPr>
+                <w:rFonts w:ascii="Times New Roman" w:cs="Times New Roman" w:eastAsia="Times New Roman" w:hAnsi="Times New Roman"/>
+                <w:b w:val="false"/>
+                <w:bCs w:val="false"/>
+                <w:sz w:val="20"/>
+                <w:szCs w:val="20"/>
+              </w:rPr>
+              <w:t xml:space="preserve">0,64</w:t>
+            </w:r>
+          </w:p>
+        </w:tc>
+        <w:tc>
+          <w:tcPr>
+            <w:tcW w:type="dxa" w:w="1526"/>
+            <w:tcBorders>
+              <w:top w:val="single" w:color="888888" w:sz="4"/>
+              <w:left w:val="single" w:color="888888" w:sz="4"/>
+              <w:bottom w:val="single" w:color="888888" w:sz="4"/>
+              <w:right w:val="single" w:color="888888" w:sz="4"/>
+            </w:tcBorders>
+            <w:tcMar>
+              <w:top w:type="dxa" w:w="60"/>
+              <w:left w:type="dxa" w:w="100"/>
+              <w:bottom w:type="dxa" w:w="60"/>
+              <w:right w:type="dxa" w:w="100"/>
+            </w:tcMar>
+          </w:tcPr>
+          <w:p>
+            <w:pPr>
+              <w:jc w:val="center"/>
+            </w:pPr>
+            <w:r>
+              <w:rPr>
+                <w:rFonts w:ascii="Times New Roman" w:cs="Times New Roman" w:eastAsia="Times New Roman" w:hAnsi="Times New Roman"/>
+                <w:b w:val="false"/>
+                <w:bCs w:val="false"/>
+                <w:sz w:val="20"/>
+                <w:szCs w:val="20"/>
+              </w:rPr>
+              <w:t xml:space="preserve">91</w:t>
+            </w:r>
+          </w:p>
+        </w:tc>
+      </w:tr>
+      <w:tr>
+        <w:trPr>
+          <w:tblHeader w:val="false"/>
+        </w:trPr>
+        <w:tc>
+          <w:tcPr>
+            <w:tcW w:type="dxa" w:w="3000"/>
+            <w:tcBorders>
+              <w:top w:val="single" w:color="888888" w:sz="4"/>
+              <w:left w:val="single" w:color="888888" w:sz="4"/>
+              <w:bottom w:val="single" w:color="888888" w:sz="4"/>
+              <w:right w:val="single" w:color="888888" w:sz="4"/>
+            </w:tcBorders>
+            <w:tcMar>
+              <w:top w:type="dxa" w:w="60"/>
+              <w:left w:type="dxa" w:w="100"/>
+              <w:bottom w:type="dxa" w:w="60"/>
+              <w:right w:type="dxa" w:w="100"/>
+            </w:tcMar>
+          </w:tcPr>
+          <w:p>
+            <w:pPr>
+              <w:jc w:val="left"/>
+            </w:pPr>
+            <w:r>
+              <w:rPr>
+                <w:rFonts w:ascii="Times New Roman" w:cs="Times New Roman" w:eastAsia="Times New Roman" w:hAnsi="Times New Roman"/>
+                <w:b w:val="false"/>
+                <w:bCs w:val="false"/>
+                <w:sz w:val="20"/>
+                <w:szCs w:val="20"/>
+              </w:rPr>
+              <w:t xml:space="preserve">Promedio macro</w:t>
+            </w:r>
+          </w:p>
+        </w:tc>
+        <w:tc>
+          <w:tcPr>
+            <w:tcW w:type="dxa" w:w="1500"/>
+            <w:tcBorders>
+              <w:top w:val="single" w:color="888888" w:sz="4"/>
+              <w:left w:val="single" w:color="888888" w:sz="4"/>
+              <w:bottom w:val="single" w:color="888888" w:sz="4"/>
+              <w:right w:val="single" w:color="888888" w:sz="4"/>
+            </w:tcBorders>
+            <w:tcMar>
+              <w:top w:type="dxa" w:w="60"/>
+              <w:left w:type="dxa" w:w="100"/>
+              <w:bottom w:type="dxa" w:w="60"/>
+              <w:right w:type="dxa" w:w="100"/>
+            </w:tcMar>
+          </w:tcPr>
+          <w:p>
+            <w:pPr>
+              <w:jc w:val="center"/>
+            </w:pPr>
+            <w:r>
+              <w:rPr>
+                <w:rFonts w:ascii="Times New Roman" w:cs="Times New Roman" w:eastAsia="Times New Roman" w:hAnsi="Times New Roman"/>
+                <w:b w:val="false"/>
+                <w:bCs w:val="false"/>
+                <w:sz w:val="20"/>
+                <w:szCs w:val="20"/>
+              </w:rPr>
+              <w:t xml:space="preserve">0,61</w:t>
+            </w:r>
+          </w:p>
+        </w:tc>
+        <w:tc>
+          <w:tcPr>
+            <w:tcW w:type="dxa" w:w="1500"/>
+            <w:tcBorders>
+              <w:top w:val="single" w:color="888888" w:sz="4"/>
+              <w:left w:val="single" w:color="888888" w:sz="4"/>
+              <w:bottom w:val="single" w:color="888888" w:sz="4"/>
+              <w:right w:val="single" w:color="888888" w:sz="4"/>
+            </w:tcBorders>
+            <w:tcMar>
+              <w:top w:type="dxa" w:w="60"/>
+              <w:left w:type="dxa" w:w="100"/>
+              <w:bottom w:type="dxa" w:w="60"/>
+              <w:right w:type="dxa" w:w="100"/>
+            </w:tcMar>
+          </w:tcPr>
+          <w:p>
+            <w:pPr>
+              <w:jc w:val="center"/>
+            </w:pPr>
+            <w:r>
+              <w:rPr>
+                <w:rFonts w:ascii="Times New Roman" w:cs="Times New Roman" w:eastAsia="Times New Roman" w:hAnsi="Times New Roman"/>
+                <w:b w:val="false"/>
+                <w:bCs w:val="false"/>
+                <w:sz w:val="20"/>
+                <w:szCs w:val="20"/>
+              </w:rPr>
+              <w:t xml:space="preserve">0,63</w:t>
+            </w:r>
+          </w:p>
+        </w:tc>
+        <w:tc>
+          <w:tcPr>
+            <w:tcW w:type="dxa" w:w="1500"/>
+            <w:tcBorders>
+              <w:top w:val="single" w:color="888888" w:sz="4"/>
+              <w:left w:val="single" w:color="888888" w:sz="4"/>
+              <w:bottom w:val="single" w:color="888888" w:sz="4"/>
+              <w:right w:val="single" w:color="888888" w:sz="4"/>
+            </w:tcBorders>
+            <w:tcMar>
+              <w:top w:type="dxa" w:w="60"/>
+              <w:left w:type="dxa" w:w="100"/>
+              <w:bottom w:type="dxa" w:w="60"/>
+              <w:right w:type="dxa" w:w="100"/>
+            </w:tcMar>
+          </w:tcPr>
+          <w:p>
+            <w:pPr>
+              <w:jc w:val="center"/>
+            </w:pPr>
+            <w:r>
+              <w:rPr>
+                <w:rFonts w:ascii="Times New Roman" w:cs="Times New Roman" w:eastAsia="Times New Roman" w:hAnsi="Times New Roman"/>
+                <w:b w:val="false"/>
+                <w:bCs w:val="false"/>
+                <w:sz w:val="20"/>
+                <w:szCs w:val="20"/>
+              </w:rPr>
+              <w:t xml:space="preserve">0,60</w:t>
+            </w:r>
+          </w:p>
+        </w:tc>
+        <w:tc>
+          <w:tcPr>
+            <w:tcW w:type="dxa" w:w="1526"/>
+            <w:tcBorders>
+              <w:top w:val="single" w:color="888888" w:sz="4"/>
+              <w:left w:val="single" w:color="888888" w:sz="4"/>
+              <w:bottom w:val="single" w:color="888888" w:sz="4"/>
+              <w:right w:val="single" w:color="888888" w:sz="4"/>
+            </w:tcBorders>
+            <w:tcMar>
+              <w:top w:type="dxa" w:w="60"/>
+              <w:left w:type="dxa" w:w="100"/>
+              <w:bottom w:type="dxa" w:w="60"/>
+              <w:right w:type="dxa" w:w="100"/>
+            </w:tcMar>
+          </w:tcPr>
+          <w:p>
+            <w:pPr>
+              <w:jc w:val="center"/>
+            </w:pPr>
+            <w:r>
+              <w:rPr>
+                <w:rFonts w:ascii="Times New Roman" w:cs="Times New Roman" w:eastAsia="Times New Roman" w:hAnsi="Times New Roman"/>
+                <w:b w:val="false"/>
+                <w:bCs w:val="false"/>
+                <w:sz w:val="20"/>
+                <w:szCs w:val="20"/>
+              </w:rPr>
+              <w:t xml:space="preserve">224</w:t>
+            </w:r>
+          </w:p>
+        </w:tc>
+      </w:tr>
+    </w:tbl>
+    <w:p>
+      <w:pPr>
+        <w:spacing w:after="200" w:before="80"/>
+        <w:jc w:val="center"/>
+      </w:pPr>
+      <w:r>
+        <w:rPr>
+          <w:rFonts w:ascii="Times New Roman" w:cs="Times New Roman" w:eastAsia="Times New Roman" w:hAnsi="Times New Roman"/>
+          <w:i/>
+          <w:iCs/>
+          <w:sz w:val="20"/>
+          <w:szCs w:val="20"/>
+        </w:rPr>
+        <w:t xml:space="preserve">Tabla 6. Reporte de clasificación en prueba (variante 4b).</w:t>
+      </w:r>
+    </w:p>
+    <w:tbl>
+      <w:tblPr>
+        <w:tblW w:type="dxa" w:w="9026"/>
+        <w:tblBorders>
+          <w:top w:val="single" w:color="auto" w:sz="4"/>
+          <w:left w:val="single" w:color="auto" w:sz="4"/>
+          <w:bottom w:val="single" w:color="auto" w:sz="4"/>
+          <w:right w:val="single" w:color="auto" w:sz="4"/>
+          <w:insideH w:val="single" w:color="auto" w:sz="4"/>
+          <w:insideV w:val="single" w:color="auto" w:sz="4"/>
+        </w:tblBorders>
+      </w:tblPr>
+      <w:tblGrid>
+        <w:gridCol w:w="3000"/>
+        <w:gridCol w:w="2000"/>
+        <w:gridCol w:w="2000"/>
+        <w:gridCol w:w="2026"/>
+      </w:tblGrid>
+      <w:tr>
+        <w:trPr>
+          <w:tblHeader/>
+        </w:trPr>
+        <w:tc>
+          <w:tcPr>
+            <w:tcW w:type="dxa" w:w="3000"/>
+            <w:tcBorders>
+              <w:top w:val="single" w:color="888888" w:sz="4"/>
+              <w:left w:val="single" w:color="888888" w:sz="4"/>
+              <w:bottom w:val="single" w:color="888888" w:sz="4"/>
+              <w:right w:val="single" w:color="888888" w:sz="4"/>
+            </w:tcBorders>
+            <w:shd w:fill="E7EEF6" w:color="auto" w:val="clear"/>
+            <w:tcMar>
+              <w:top w:type="dxa" w:w="60"/>
+              <w:left w:type="dxa" w:w="100"/>
+              <w:bottom w:type="dxa" w:w="60"/>
+              <w:right w:type="dxa" w:w="100"/>
+            </w:tcMar>
+          </w:tcPr>
+          <w:p>
+            <w:pPr>
+              <w:jc w:val="left"/>
+            </w:pPr>
+            <w:r>
+              <w:rPr>
+                <w:rFonts w:ascii="Times New Roman" w:cs="Times New Roman" w:eastAsia="Times New Roman" w:hAnsi="Times New Roman"/>
+                <w:b/>
+                <w:bCs/>
+                <w:sz w:val="20"/>
+                <w:szCs w:val="20"/>
+              </w:rPr>
+              <w:t xml:space="preserve">Real / Predicho</w:t>
+            </w:r>
+          </w:p>
+        </w:tc>
+        <w:tc>
+          <w:tcPr>
+            <w:tcW w:type="dxa" w:w="2000"/>
+            <w:tcBorders>
+              <w:top w:val="single" w:color="888888" w:sz="4"/>
+              <w:left w:val="single" w:color="888888" w:sz="4"/>
+              <w:bottom w:val="single" w:color="888888" w:sz="4"/>
+              <w:right w:val="single" w:color="888888" w:sz="4"/>
+            </w:tcBorders>
+            <w:shd w:fill="E7EEF6" w:color="auto" w:val="clear"/>
+            <w:tcMar>
+              <w:top w:type="dxa" w:w="60"/>
+              <w:left w:type="dxa" w:w="100"/>
+              <w:bottom w:type="dxa" w:w="60"/>
+              <w:right w:type="dxa" w:w="100"/>
+            </w:tcMar>
+          </w:tcPr>
+          <w:p>
+            <w:pPr>
+              <w:jc w:val="center"/>
+            </w:pPr>
+            <w:r>
+              <w:rPr>
+                <w:rFonts w:ascii="Times New Roman" w:cs="Times New Roman" w:eastAsia="Times New Roman" w:hAnsi="Times New Roman"/>
+                <w:b/>
+                <w:bCs/>
+                <w:sz w:val="20"/>
+                <w:szCs w:val="20"/>
+              </w:rPr>
+              <w:t xml:space="preserve">Sana</w:t>
+            </w:r>
+          </w:p>
+        </w:tc>
+        <w:tc>
+          <w:tcPr>
+            <w:tcW w:type="dxa" w:w="2000"/>
+            <w:tcBorders>
+              <w:top w:val="single" w:color="888888" w:sz="4"/>
+              <w:left w:val="single" w:color="888888" w:sz="4"/>
+              <w:bottom w:val="single" w:color="888888" w:sz="4"/>
+              <w:right w:val="single" w:color="888888" w:sz="4"/>
+            </w:tcBorders>
+            <w:shd w:fill="E7EEF6" w:color="auto" w:val="clear"/>
+            <w:tcMar>
+              <w:top w:type="dxa" w:w="60"/>
+              <w:left w:type="dxa" w:w="100"/>
+              <w:bottom w:type="dxa" w:w="60"/>
+              <w:right w:type="dxa" w:w="100"/>
+            </w:tcMar>
+          </w:tcPr>
+          <w:p>
+            <w:pPr>
+              <w:jc w:val="center"/>
+            </w:pPr>
+            <w:r>
+              <w:rPr>
+                <w:rFonts w:ascii="Times New Roman" w:cs="Times New Roman" w:eastAsia="Times New Roman" w:hAnsi="Times New Roman"/>
+                <w:b/>
+                <w:bCs/>
+                <w:sz w:val="20"/>
+                <w:szCs w:val="20"/>
+              </w:rPr>
+              <w:t xml:space="preserve">Araña roja</w:t>
+            </w:r>
+          </w:p>
+        </w:tc>
+        <w:tc>
+          <w:tcPr>
+            <w:tcW w:type="dxa" w:w="2026"/>
+            <w:tcBorders>
+              <w:top w:val="single" w:color="888888" w:sz="4"/>
+              <w:left w:val="single" w:color="888888" w:sz="4"/>
+              <w:bottom w:val="single" w:color="888888" w:sz="4"/>
+              <w:right w:val="single" w:color="888888" w:sz="4"/>
+            </w:tcBorders>
+            <w:shd w:fill="E7EEF6" w:color="auto" w:val="clear"/>
+            <w:tcMar>
+              <w:top w:type="dxa" w:w="60"/>
+              <w:left w:type="dxa" w:w="100"/>
+              <w:bottom w:type="dxa" w:w="60"/>
+              <w:right w:type="dxa" w:w="100"/>
+            </w:tcMar>
+          </w:tcPr>
+          <w:p>
+            <w:pPr>
+              <w:jc w:val="center"/>
+            </w:pPr>
+            <w:r>
+              <w:rPr>
+                <w:rFonts w:ascii="Times New Roman" w:cs="Times New Roman" w:eastAsia="Times New Roman" w:hAnsi="Times New Roman"/>
+                <w:b/>
+                <w:bCs/>
+                <w:sz w:val="20"/>
+                <w:szCs w:val="20"/>
+              </w:rPr>
+              <w:t xml:space="preserve">Roya</w:t>
+            </w:r>
+          </w:p>
+        </w:tc>
+      </w:tr>
+      <w:tr>
+        <w:trPr>
+          <w:tblHeader w:val="false"/>
+        </w:trPr>
+        <w:tc>
+          <w:tcPr>
+            <w:tcW w:type="dxa" w:w="3000"/>
+            <w:tcBorders>
+              <w:top w:val="single" w:color="888888" w:sz="4"/>
+              <w:left w:val="single" w:color="888888" w:sz="4"/>
+              <w:bottom w:val="single" w:color="888888" w:sz="4"/>
+              <w:right w:val="single" w:color="888888" w:sz="4"/>
+            </w:tcBorders>
+            <w:tcMar>
+              <w:top w:type="dxa" w:w="60"/>
+              <w:left w:type="dxa" w:w="100"/>
+              <w:bottom w:type="dxa" w:w="60"/>
+              <w:right w:type="dxa" w:w="100"/>
+            </w:tcMar>
+          </w:tcPr>
+          <w:p>
+            <w:pPr>
+              <w:jc w:val="left"/>
+            </w:pPr>
+            <w:r>
+              <w:rPr>
+                <w:rFonts w:ascii="Times New Roman" w:cs="Times New Roman" w:eastAsia="Times New Roman" w:hAnsi="Times New Roman"/>
+                <w:b w:val="false"/>
+                <w:bCs w:val="false"/>
+                <w:sz w:val="20"/>
+                <w:szCs w:val="20"/>
+              </w:rPr>
+              <w:t xml:space="preserve">Sana</w:t>
+            </w:r>
+          </w:p>
+        </w:tc>
+        <w:tc>
+          <w:tcPr>
+            <w:tcW w:type="dxa" w:w="2000"/>
+            <w:tcBorders>
+              <w:top w:val="single" w:color="888888" w:sz="4"/>
+              <w:left w:val="single" w:color="888888" w:sz="4"/>
+              <w:bottom w:val="single" w:color="888888" w:sz="4"/>
+              <w:right w:val="single" w:color="888888" w:sz="4"/>
+            </w:tcBorders>
+            <w:tcMar>
+              <w:top w:type="dxa" w:w="60"/>
+              <w:left w:type="dxa" w:w="100"/>
+              <w:bottom w:type="dxa" w:w="60"/>
+              <w:right w:type="dxa" w:w="100"/>
+            </w:tcMar>
+          </w:tcPr>
+          <w:p>
+            <w:pPr>
+              <w:jc w:val="center"/>
+            </w:pPr>
+            <w:r>
+              <w:rPr>
+                <w:rFonts w:ascii="Times New Roman" w:cs="Times New Roman" w:eastAsia="Times New Roman" w:hAnsi="Times New Roman"/>
+                <w:b w:val="false"/>
+                <w:bCs w:val="false"/>
+                <w:sz w:val="20"/>
+                <w:szCs w:val="20"/>
+              </w:rPr>
+              <w:t xml:space="preserve">93</w:t>
+            </w:r>
+          </w:p>
+        </w:tc>
+        <w:tc>
+          <w:tcPr>
+            <w:tcW w:type="dxa" w:w="2000"/>
+            <w:tcBorders>
+              <w:top w:val="single" w:color="888888" w:sz="4"/>
+              <w:left w:val="single" w:color="888888" w:sz="4"/>
+              <w:bottom w:val="single" w:color="888888" w:sz="4"/>
+              <w:right w:val="single" w:color="888888" w:sz="4"/>
+            </w:tcBorders>
+            <w:tcMar>
+              <w:top w:type="dxa" w:w="60"/>
+              <w:left w:type="dxa" w:w="100"/>
+              <w:bottom w:type="dxa" w:w="60"/>
+              <w:right w:type="dxa" w:w="100"/>
+            </w:tcMar>
+          </w:tcPr>
+          <w:p>
+            <w:pPr>
+              <w:jc w:val="center"/>
+            </w:pPr>
+            <w:r>
+              <w:rPr>
+                <w:rFonts w:ascii="Times New Roman" w:cs="Times New Roman" w:eastAsia="Times New Roman" w:hAnsi="Times New Roman"/>
+                <w:b w:val="false"/>
+                <w:bCs w:val="false"/>
+                <w:sz w:val="20"/>
+                <w:szCs w:val="20"/>
+              </w:rPr>
+              <w:t xml:space="preserve">9</w:t>
+            </w:r>
+          </w:p>
+        </w:tc>
+        <w:tc>
+          <w:tcPr>
+            <w:tcW w:type="dxa" w:w="2026"/>
+            <w:tcBorders>
+              <w:top w:val="single" w:color="888888" w:sz="4"/>
+              <w:left w:val="single" w:color="888888" w:sz="4"/>
+              <w:bottom w:val="single" w:color="888888" w:sz="4"/>
+              <w:right w:val="single" w:color="888888" w:sz="4"/>
+            </w:tcBorders>
+            <w:tcMar>
+              <w:top w:type="dxa" w:w="60"/>
+              <w:left w:type="dxa" w:w="100"/>
+              <w:bottom w:type="dxa" w:w="60"/>
+              <w:right w:type="dxa" w:w="100"/>
+            </w:tcMar>
+          </w:tcPr>
+          <w:p>
+            <w:pPr>
+              <w:jc w:val="center"/>
+            </w:pPr>
+            <w:r>
+              <w:rPr>
+                <w:rFonts w:ascii="Times New Roman" w:cs="Times New Roman" w:eastAsia="Times New Roman" w:hAnsi="Times New Roman"/>
+                <w:b w:val="false"/>
+                <w:bCs w:val="false"/>
+                <w:sz w:val="20"/>
+                <w:szCs w:val="20"/>
+              </w:rPr>
+              <w:t xml:space="preserve">10</w:t>
+            </w:r>
+          </w:p>
+        </w:tc>
+      </w:tr>
+      <w:tr>
+        <w:trPr>
+          <w:tblHeader w:val="false"/>
+        </w:trPr>
+        <w:tc>
+          <w:tcPr>
+            <w:tcW w:type="dxa" w:w="3000"/>
+            <w:tcBorders>
+              <w:top w:val="single" w:color="888888" w:sz="4"/>
+              <w:left w:val="single" w:color="888888" w:sz="4"/>
+              <w:bottom w:val="single" w:color="888888" w:sz="4"/>
+              <w:right w:val="single" w:color="888888" w:sz="4"/>
+            </w:tcBorders>
+            <w:tcMar>
+              <w:top w:type="dxa" w:w="60"/>
+              <w:left w:type="dxa" w:w="100"/>
+              <w:bottom w:type="dxa" w:w="60"/>
+              <w:right w:type="dxa" w:w="100"/>
+            </w:tcMar>
+          </w:tcPr>
+          <w:p>
+            <w:pPr>
+              <w:jc w:val="left"/>
+            </w:pPr>
+            <w:r>
+              <w:rPr>
+                <w:rFonts w:ascii="Times New Roman" w:cs="Times New Roman" w:eastAsia="Times New Roman" w:hAnsi="Times New Roman"/>
+                <w:b w:val="false"/>
+                <w:bCs w:val="false"/>
+                <w:sz w:val="20"/>
+                <w:szCs w:val="20"/>
+              </w:rPr>
+              <w:t xml:space="preserve">Araña roja</w:t>
+            </w:r>
+          </w:p>
+        </w:tc>
+        <w:tc>
+          <w:tcPr>
+            <w:tcW w:type="dxa" w:w="2000"/>
+            <w:tcBorders>
+              <w:top w:val="single" w:color="888888" w:sz="4"/>
+              <w:left w:val="single" w:color="888888" w:sz="4"/>
+              <w:bottom w:val="single" w:color="888888" w:sz="4"/>
+              <w:right w:val="single" w:color="888888" w:sz="4"/>
+            </w:tcBorders>
+            <w:tcMar>
+              <w:top w:type="dxa" w:w="60"/>
+              <w:left w:type="dxa" w:w="100"/>
+              <w:bottom w:type="dxa" w:w="60"/>
+              <w:right w:type="dxa" w:w="100"/>
+            </w:tcMar>
+          </w:tcPr>
+          <w:p>
+            <w:pPr>
+              <w:jc w:val="center"/>
+            </w:pPr>
+            <w:r>
+              <w:rPr>
+                <w:rFonts w:ascii="Times New Roman" w:cs="Times New Roman" w:eastAsia="Times New Roman" w:hAnsi="Times New Roman"/>
+                <w:b w:val="false"/>
+                <w:bCs w:val="false"/>
+                <w:sz w:val="20"/>
+                <w:szCs w:val="20"/>
+              </w:rPr>
+              <w:t xml:space="preserve">5</w:t>
+            </w:r>
+          </w:p>
+        </w:tc>
+        <w:tc>
+          <w:tcPr>
+            <w:tcW w:type="dxa" w:w="2000"/>
+            <w:tcBorders>
+              <w:top w:val="single" w:color="888888" w:sz="4"/>
+              <w:left w:val="single" w:color="888888" w:sz="4"/>
+              <w:bottom w:val="single" w:color="888888" w:sz="4"/>
+              <w:right w:val="single" w:color="888888" w:sz="4"/>
+            </w:tcBorders>
+            <w:tcMar>
+              <w:top w:type="dxa" w:w="60"/>
+              <w:left w:type="dxa" w:w="100"/>
+              <w:bottom w:type="dxa" w:w="60"/>
+              <w:right w:type="dxa" w:w="100"/>
+            </w:tcMar>
+          </w:tcPr>
+          <w:p>
+            <w:pPr>
+              <w:jc w:val="center"/>
+            </w:pPr>
+            <w:r>
+              <w:rPr>
+                <w:rFonts w:ascii="Times New Roman" w:cs="Times New Roman" w:eastAsia="Times New Roman" w:hAnsi="Times New Roman"/>
+                <w:b w:val="false"/>
+                <w:bCs w:val="false"/>
+                <w:sz w:val="20"/>
+                <w:szCs w:val="20"/>
+              </w:rPr>
+              <w:t xml:space="preserve">11</w:t>
+            </w:r>
+          </w:p>
+        </w:tc>
+        <w:tc>
+          <w:tcPr>
+            <w:tcW w:type="dxa" w:w="2026"/>
+            <w:tcBorders>
+              <w:top w:val="single" w:color="888888" w:sz="4"/>
+              <w:left w:val="single" w:color="888888" w:sz="4"/>
+              <w:bottom w:val="single" w:color="888888" w:sz="4"/>
+              <w:right w:val="single" w:color="888888" w:sz="4"/>
+            </w:tcBorders>
+            <w:tcMar>
+              <w:top w:type="dxa" w:w="60"/>
+              <w:left w:type="dxa" w:w="100"/>
+              <w:bottom w:type="dxa" w:w="60"/>
+              <w:right w:type="dxa" w:w="100"/>
+            </w:tcMar>
+          </w:tcPr>
+          <w:p>
+            <w:pPr>
+              <w:jc w:val="center"/>
+            </w:pPr>
+            <w:r>
+              <w:rPr>
+                <w:rFonts w:ascii="Times New Roman" w:cs="Times New Roman" w:eastAsia="Times New Roman" w:hAnsi="Times New Roman"/>
+                <w:b w:val="false"/>
+                <w:bCs w:val="false"/>
+                <w:sz w:val="20"/>
+                <w:szCs w:val="20"/>
+              </w:rPr>
+              <w:t xml:space="preserve">5</w:t>
+            </w:r>
+          </w:p>
+        </w:tc>
+      </w:tr>
+      <w:tr>
+        <w:trPr>
+          <w:tblHeader w:val="false"/>
+        </w:trPr>
+        <w:tc>
+          <w:tcPr>
+            <w:tcW w:type="dxa" w:w="3000"/>
+            <w:tcBorders>
+              <w:top w:val="single" w:color="888888" w:sz="4"/>
+              <w:left w:val="single" w:color="888888" w:sz="4"/>
+              <w:bottom w:val="single" w:color="888888" w:sz="4"/>
+              <w:right w:val="single" w:color="888888" w:sz="4"/>
+            </w:tcBorders>
+            <w:tcMar>
+              <w:top w:type="dxa" w:w="60"/>
+              <w:left w:type="dxa" w:w="100"/>
+              <w:bottom w:type="dxa" w:w="60"/>
+              <w:right w:type="dxa" w:w="100"/>
+            </w:tcMar>
+          </w:tcPr>
+          <w:p>
+            <w:pPr>
+              <w:jc w:val="left"/>
+            </w:pPr>
+            <w:r>
+              <w:rPr>
+                <w:rFonts w:ascii="Times New Roman" w:cs="Times New Roman" w:eastAsia="Times New Roman" w:hAnsi="Times New Roman"/>
+                <w:b w:val="false"/>
+                <w:bCs w:val="false"/>
+                <w:sz w:val="20"/>
+                <w:szCs w:val="20"/>
+              </w:rPr>
+              <w:t xml:space="preserve">Roya</w:t>
+            </w:r>
+          </w:p>
+        </w:tc>
+        <w:tc>
+          <w:tcPr>
+            <w:tcW w:type="dxa" w:w="2000"/>
+            <w:tcBorders>
+              <w:top w:val="single" w:color="888888" w:sz="4"/>
+              <w:left w:val="single" w:color="888888" w:sz="4"/>
+              <w:bottom w:val="single" w:color="888888" w:sz="4"/>
+              <w:right w:val="single" w:color="888888" w:sz="4"/>
+            </w:tcBorders>
+            <w:tcMar>
+              <w:top w:type="dxa" w:w="60"/>
+              <w:left w:type="dxa" w:w="100"/>
+              <w:bottom w:type="dxa" w:w="60"/>
+              <w:right w:type="dxa" w:w="100"/>
+            </w:tcMar>
+          </w:tcPr>
+          <w:p>
+            <w:pPr>
+              <w:jc w:val="center"/>
+            </w:pPr>
+            <w:r>
+              <w:rPr>
+                <w:rFonts w:ascii="Times New Roman" w:cs="Times New Roman" w:eastAsia="Times New Roman" w:hAnsi="Times New Roman"/>
+                <w:b w:val="false"/>
+                <w:bCs w:val="false"/>
+                <w:sz w:val="20"/>
+                <w:szCs w:val="20"/>
+              </w:rPr>
+              <w:t xml:space="preserve">21</w:t>
+            </w:r>
+          </w:p>
+        </w:tc>
+        <w:tc>
+          <w:tcPr>
+            <w:tcW w:type="dxa" w:w="2000"/>
+            <w:tcBorders>
+              <w:top w:val="single" w:color="888888" w:sz="4"/>
+              <w:left w:val="single" w:color="888888" w:sz="4"/>
+              <w:bottom w:val="single" w:color="888888" w:sz="4"/>
+              <w:right w:val="single" w:color="888888" w:sz="4"/>
+            </w:tcBorders>
+            <w:tcMar>
+              <w:top w:type="dxa" w:w="60"/>
+              <w:left w:type="dxa" w:w="100"/>
+              <w:bottom w:type="dxa" w:w="60"/>
+              <w:right w:type="dxa" w:w="100"/>
+            </w:tcMar>
+          </w:tcPr>
+          <w:p>
+            <w:pPr>
+              <w:jc w:val="center"/>
+            </w:pPr>
+            <w:r>
+              <w:rPr>
+                <w:rFonts w:ascii="Times New Roman" w:cs="Times New Roman" w:eastAsia="Times New Roman" w:hAnsi="Times New Roman"/>
+                <w:b w:val="false"/>
+                <w:bCs w:val="false"/>
+                <w:sz w:val="20"/>
+                <w:szCs w:val="20"/>
+              </w:rPr>
+              <w:t xml:space="preserve">20</w:t>
+            </w:r>
+          </w:p>
+        </w:tc>
+        <w:tc>
+          <w:tcPr>
+            <w:tcW w:type="dxa" w:w="2026"/>
+            <w:tcBorders>
+              <w:top w:val="single" w:color="888888" w:sz="4"/>
+              <w:left w:val="single" w:color="888888" w:sz="4"/>
+              <w:bottom w:val="single" w:color="888888" w:sz="4"/>
+              <w:right w:val="single" w:color="888888" w:sz="4"/>
+            </w:tcBorders>
+            <w:tcMar>
+              <w:top w:type="dxa" w:w="60"/>
+              <w:left w:type="dxa" w:w="100"/>
+              <w:bottom w:type="dxa" w:w="60"/>
+              <w:right w:type="dxa" w:w="100"/>
+            </w:tcMar>
+          </w:tcPr>
+          <w:p>
+            <w:pPr>
+              <w:jc w:val="center"/>
+            </w:pPr>
+            <w:r>
+              <w:rPr>
+                <w:rFonts w:ascii="Times New Roman" w:cs="Times New Roman" w:eastAsia="Times New Roman" w:hAnsi="Times New Roman"/>
+                <w:b w:val="false"/>
+                <w:bCs w:val="false"/>
+                <w:sz w:val="20"/>
+                <w:szCs w:val="20"/>
+              </w:rPr>
+              <w:t xml:space="preserve">50</w:t>
+            </w:r>
+          </w:p>
+        </w:tc>
+      </w:tr>
+    </w:tbl>
+    <w:p>
+      <w:pPr>
+        <w:spacing w:after="200" w:before="80"/>
+        <w:jc w:val="center"/>
+      </w:pPr>
+      <w:r>
+        <w:rPr>
+          <w:rFonts w:ascii="Times New Roman" w:cs="Times New Roman" w:eastAsia="Times New Roman" w:hAnsi="Times New Roman"/>
+          <w:i/>
+          <w:iCs/>
+          <w:sz w:val="20"/>
+          <w:szCs w:val="20"/>
+        </w:rPr>
+        <w:t xml:space="preserve">Tabla 7. Matriz de confusión en prueba (variante 4b).</w:t>
       </w:r>
     </w:p>
     <w:p>
@@ -4176,24 +6013,35 @@
           <w:sz w:val="24"/>
           <w:szCs w:val="24"/>
         </w:rPr>
-        <w:t xml:space="preserve">La validación cruzada muestra un desempeño estable en exactitud (≈0,73), pero el F1 macro bajo apunta al desbalance de clases como principal limitación. La ejecución preliminar muestra el caso extremo: un modelo poco entrenado ignora por completo la clase minoritaria sin que la exactitud global lo delate, lo que justifica reportar métricas por clase y no solo la exactitud.</w:t>
+        <w:t xml:space="preserve">En validación cruzada el desempeño en exactitud es estable (≈0,73), pero el F1 macro bajo (≈0,59) apunta al desbalance de clases como principal limitación; la ejecución preliminar mostró el caso extremo, en el que un modelo poco entrenado ignora por completo la clase minoritaria sin que la exactitud global lo delate. Por eso se reportan métricas por clase.</w:t>
       </w:r>
     </w:p>
     <w:p>
       <w:pPr>
-        <w:spacing w:after="160"/>
+        <w:spacing w:after="160" w:line="300"/>
+        <w:jc w:val="both"/>
       </w:pPr>
       <w:r>
         <w:rPr>
           <w:rFonts w:ascii="Times New Roman" w:cs="Times New Roman" w:eastAsia="Times New Roman" w:hAnsi="Times New Roman"/>
-          <w:b/>
-          <w:bCs/>
           <w:sz w:val="24"/>
           <w:szCs w:val="24"/>
-          <w:highlight w:val="yellow"/>
-          <w:highlightCs w:val="yellow"/>
         </w:rPr>
-        <w:t xml:space="preserve">[PENDIENTE: discutir, con los resultados reales, si los pesos de clase, el ajuste fino y la GAN mejoran el F1 de araña roja, y si la GAN aporta algo más que el sobremuestreo con imágenes reales (variante 4b).]</w:t>
+        <w:t xml:space="preserve">Respecto a las mejoras, los mayores avances en la clase minoritaria provinieron de aumentar su presencia en el entrenamiento: con 150 imágenes adicionales, el F1 de araña roja pasó de 0,324 (base) a 0,507 con GAN y 0,471 con sobremuestreo real. La GAN no superó claramente a su control: obtuvo mejor F1 en araña roja, pero menor F1 macro y exactitud que el sobremuestreo real. Dado que las diferencias son de uno a cuatro puntos, con una corrida por variante y solo 29 imágenes de araña roja en validación, no hay evidencia suficiente para afirmar que la GAN aporte más que repetir imágenes reales. Los pesos de clase, solos, no ayudaron.</w:t>
+      </w:r>
+    </w:p>
+    <w:p>
+      <w:pPr>
+        <w:spacing w:after="160" w:line="300"/>
+        <w:jc w:val="both"/>
+      </w:pPr>
+      <w:r>
+        <w:rPr>
+          <w:rFonts w:ascii="Times New Roman" w:cs="Times New Roman" w:eastAsia="Times New Roman" w:hAnsi="Times New Roman"/>
+          <w:sz w:val="24"/>
+          <w:szCs w:val="24"/>
+        </w:rPr>
+        <w:t xml:space="preserve">En prueba, el F1 macro (0,60) es coherente con el de la validación cruzada (0,58–0,61), mientras que la exactitud (0,69) quedó algo por debajo (0,72–0,75). La clase araña roja alcanza un recall de 0,52 (11 de 21), pero con precisión de 0,28: 29 imágenes de otras clases se clasificaron como araña roja (9 sanas y 20 de roya). Al mismo tiempo, la roya perdió recall (0,55): 21 de sus imágenes se clasificaron como sanas y 20 como araña roja. Es decir, la mejor detección de la clase minoritaria coincide con una mayor confusión con la roya.</w:t>
       </w:r>
     </w:p>
     <w:p>
@@ -4249,7 +6097,7 @@
           <w:sz w:val="24"/>
           <w:szCs w:val="24"/>
         </w:rPr>
-        <w:t xml:space="preserve">Cada variante de la sección 3.5 se entrenó una sola vez; diferencias pequeñas pueden deberse al azar.</w:t>
+        <w:t xml:space="preserve">Cada variante de la sección 3.5 se entrenó una sola vez; diferencias pequeñas pueden deberse al azar. La elección de la variante 4b se basó en una diferencia de 0,01 de F1 macro frente a la GAN en 244 imágenes de validación.</w:t>
       </w:r>
     </w:p>
     <w:p>
@@ -4384,19 +6232,59 @@
     </w:p>
     <w:p>
       <w:pPr>
-        <w:spacing w:after="160"/>
+        <w:pStyle w:val="ListParagraph"/>
+        <w:numPr>
+          <w:ilvl w:val="0"/>
+          <w:numId w:val="2"/>
+        </w:numPr>
+        <w:spacing w:after="80"/>
+        <w:jc w:val="both"/>
       </w:pPr>
       <w:r>
         <w:rPr>
           <w:rFonts w:ascii="Times New Roman" w:cs="Times New Roman" w:eastAsia="Times New Roman" w:hAnsi="Times New Roman"/>
-          <w:b/>
-          <w:bCs/>
           <w:sz w:val="24"/>
           <w:szCs w:val="24"/>
-          <w:highlight w:val="yellow"/>
-          <w:highlightCs w:val="yellow"/>
         </w:rPr>
-        <w:t xml:space="preserve">[PENDIENTE: conclusión final sobre el efecto de las mejoras y el desempeño en prueba.]</w:t>
+        <w:t xml:space="preserve">Entre las variantes comparadas en validación, la mejor por F1 macro fue el sobremuestreo con imágenes reales (0,676); en prueba logró exactitud de 0,69 y F1 macro de 0,60.</w:t>
+      </w:r>
+    </w:p>
+    <w:p>
+      <w:pPr>
+        <w:pStyle w:val="ListParagraph"/>
+        <w:numPr>
+          <w:ilvl w:val="0"/>
+          <w:numId w:val="2"/>
+        </w:numPr>
+        <w:spacing w:after="80"/>
+        <w:jc w:val="both"/>
+      </w:pPr>
+      <w:r>
+        <w:rPr>
+          <w:rFonts w:ascii="Times New Roman" w:cs="Times New Roman" w:eastAsia="Times New Roman" w:hAnsi="Times New Roman"/>
+          <w:sz w:val="24"/>
+          <w:szCs w:val="24"/>
+        </w:rPr>
+        <w:t xml:space="preserve">La GAN mejoró el F1 de la clase minoritaria frente al modelo base (0,507 frente a 0,324 en validación), pero no superó claramente al sobremuestreo real; los pesos de clase por sí solos no mejoraron el resultado.</w:t>
+      </w:r>
+    </w:p>
+    <w:p>
+      <w:pPr>
+        <w:pStyle w:val="ListParagraph"/>
+        <w:numPr>
+          <w:ilvl w:val="0"/>
+          <w:numId w:val="2"/>
+        </w:numPr>
+        <w:spacing w:after="80"/>
+        <w:jc w:val="both"/>
+      </w:pPr>
+      <w:r>
+        <w:rPr>
+          <w:rFonts w:ascii="Times New Roman" w:cs="Times New Roman" w:eastAsia="Times New Roman" w:hAnsi="Times New Roman"/>
+          <w:sz w:val="24"/>
+          <w:szCs w:val="24"/>
+        </w:rPr>
+        <w:t xml:space="preserve">Trabajo futuro: repetir cada variante con varias semillas o validación cruzada, probar una GAN de mayor resolución y estratificar la partición por clase para disponer de más imágenes de araña roja en prueba.</w:t>
       </w:r>
     </w:p>
     <w:p>

</xml_diff>